<commit_message>
Scroll menu y Logica inversa (Devolucion de comision)
</commit_message>
<xml_diff>
--- a/LISTA DE MEJORAS POR REALIZAR.docx
+++ b/LISTA DE MEJORAS POR REALIZAR.docx
@@ -4,6 +4,1624 @@
   <w:body>
     <w:p>
       <w:pPr>
+        <w:pStyle w:val="Heading3"/>
+        <w:jc w:val="center"/>
+        <w:rPr>
+          <w:b/>
+          <w:bCs/>
+          <w:sz w:val="48"/>
+          <w:szCs w:val="48"/>
+        </w:rPr>
+      </w:pPr>
+      <w:r>
+        <w:rPr>
+          <w:b/>
+          <w:bCs/>
+          <w:sz w:val="48"/>
+          <w:szCs w:val="48"/>
+        </w:rPr>
+        <w:t xml:space="preserve">La Solución: CSS </w:t>
+      </w:r>
+      <w:proofErr w:type="spellStart"/>
+      <w:r>
+        <w:rPr>
+          <w:b/>
+          <w:bCs/>
+          <w:sz w:val="48"/>
+          <w:szCs w:val="48"/>
+        </w:rPr>
+        <w:t>Swipe</w:t>
+      </w:r>
+      <w:proofErr w:type="spellEnd"/>
+      <w:r>
+        <w:rPr>
+          <w:b/>
+          <w:bCs/>
+          <w:sz w:val="48"/>
+          <w:szCs w:val="48"/>
+        </w:rPr>
+        <w:t xml:space="preserve"> </w:t>
+      </w:r>
+      <w:proofErr w:type="spellStart"/>
+      <w:r>
+        <w:rPr>
+          <w:b/>
+          <w:bCs/>
+          <w:sz w:val="48"/>
+          <w:szCs w:val="48"/>
+        </w:rPr>
+        <w:t>Menu</w:t>
+      </w:r>
+      <w:proofErr w:type="spellEnd"/>
+      <w:r>
+        <w:rPr>
+          <w:b/>
+          <w:bCs/>
+          <w:sz w:val="48"/>
+          <w:szCs w:val="48"/>
+        </w:rPr>
+        <w:t xml:space="preserve"> (</w:t>
+      </w:r>
+      <w:proofErr w:type="spellStart"/>
+      <w:r>
+        <w:rPr>
+          <w:b/>
+          <w:bCs/>
+          <w:sz w:val="48"/>
+          <w:szCs w:val="48"/>
+        </w:rPr>
+        <w:t>Scroll</w:t>
+      </w:r>
+      <w:proofErr w:type="spellEnd"/>
+      <w:r>
+        <w:rPr>
+          <w:b/>
+          <w:bCs/>
+          <w:sz w:val="48"/>
+          <w:szCs w:val="48"/>
+        </w:rPr>
+        <w:t xml:space="preserve"> Horizontal)</w:t>
+      </w:r>
+    </w:p>
+    <w:p>
+      <w:pPr>
+        <w:pStyle w:val="NormalWeb"/>
+        <w:rPr>
+          <w:lang w:val="es-ES"/>
+        </w:rPr>
+      </w:pPr>
+      <w:r>
+        <w:rPr>
+          <w:lang w:val="es-ES"/>
+        </w:rPr>
+        <w:t>El objetivo es decirle al contenedor de tus botones que, en lugar de aplastarlos o saltar a la siguiente línea, los mantenga en una sola fila y permita deslizar el dedo (o el ratón) hacia los lados, ocultando la fea barra de desplazamiento predeterminada del navegador.</w:t>
+      </w:r>
+    </w:p>
+    <w:p>
+      <w:pPr>
+        <w:pStyle w:val="NormalWeb"/>
+        <w:rPr>
+          <w:lang w:val="es-ES"/>
+        </w:rPr>
+      </w:pPr>
+      <w:r>
+        <w:rPr>
+          <w:b/>
+          <w:bCs/>
+          <w:lang w:val="es-ES"/>
+        </w:rPr>
+        <w:t>Instrucciones para mañana:</w:t>
+      </w:r>
+      <w:r>
+        <w:rPr>
+          <w:lang w:val="es-ES"/>
+        </w:rPr>
+        <w:t xml:space="preserve"> Abre tu archivo de estilos principales: </w:t>
+      </w:r>
+      <w:proofErr w:type="spellStart"/>
+      <w:r>
+        <w:rPr>
+          <w:rStyle w:val="HTMLCode"/>
+          <w:rFonts w:eastAsiaTheme="majorEastAsia"/>
+          <w:b/>
+          <w:bCs/>
+          <w:lang w:val="es-ES"/>
+        </w:rPr>
+        <w:t>assets</w:t>
+      </w:r>
+      <w:proofErr w:type="spellEnd"/>
+      <w:r>
+        <w:rPr>
+          <w:rStyle w:val="HTMLCode"/>
+          <w:rFonts w:eastAsiaTheme="majorEastAsia"/>
+          <w:b/>
+          <w:bCs/>
+          <w:lang w:val="es-ES"/>
+        </w:rPr>
+        <w:t>/</w:t>
+      </w:r>
+      <w:proofErr w:type="spellStart"/>
+      <w:r>
+        <w:rPr>
+          <w:rStyle w:val="HTMLCode"/>
+          <w:rFonts w:eastAsiaTheme="majorEastAsia"/>
+          <w:b/>
+          <w:bCs/>
+          <w:lang w:val="es-ES"/>
+        </w:rPr>
+        <w:t>css</w:t>
+      </w:r>
+      <w:proofErr w:type="spellEnd"/>
+      <w:r>
+        <w:rPr>
+          <w:rStyle w:val="HTMLCode"/>
+          <w:rFonts w:eastAsiaTheme="majorEastAsia"/>
+          <w:b/>
+          <w:bCs/>
+          <w:lang w:val="es-ES"/>
+        </w:rPr>
+        <w:t>/suite-styles.css</w:t>
+      </w:r>
+      <w:r>
+        <w:rPr>
+          <w:lang w:val="es-ES"/>
+        </w:rPr>
+        <w:t xml:space="preserve">. Busca la </w:t>
+      </w:r>
+      <w:proofErr w:type="gramStart"/>
+      <w:r>
+        <w:rPr>
+          <w:lang w:val="es-ES"/>
+        </w:rPr>
+        <w:t xml:space="preserve">clase </w:t>
+      </w:r>
+      <w:r>
+        <w:rPr>
+          <w:rStyle w:val="HTMLCode"/>
+          <w:rFonts w:eastAsiaTheme="majorEastAsia"/>
+          <w:lang w:val="es-ES"/>
+        </w:rPr>
+        <w:t>.suite</w:t>
+      </w:r>
+      <w:proofErr w:type="gramEnd"/>
+      <w:r>
+        <w:rPr>
+          <w:rStyle w:val="HTMLCode"/>
+          <w:rFonts w:eastAsiaTheme="majorEastAsia"/>
+          <w:lang w:val="es-ES"/>
+        </w:rPr>
+        <w:t>-</w:t>
+      </w:r>
+      <w:proofErr w:type="spellStart"/>
+      <w:r>
+        <w:rPr>
+          <w:rStyle w:val="HTMLCode"/>
+          <w:rFonts w:eastAsiaTheme="majorEastAsia"/>
+          <w:lang w:val="es-ES"/>
+        </w:rPr>
+        <w:t>tabs</w:t>
+      </w:r>
+      <w:proofErr w:type="spellEnd"/>
+      <w:r>
+        <w:rPr>
+          <w:rStyle w:val="HTMLCode"/>
+          <w:rFonts w:eastAsiaTheme="majorEastAsia"/>
+          <w:lang w:val="es-ES"/>
+        </w:rPr>
+        <w:t>-</w:t>
+      </w:r>
+      <w:proofErr w:type="spellStart"/>
+      <w:r>
+        <w:rPr>
+          <w:rStyle w:val="HTMLCode"/>
+          <w:rFonts w:eastAsiaTheme="majorEastAsia"/>
+          <w:lang w:val="es-ES"/>
+        </w:rPr>
+        <w:t>modern</w:t>
+      </w:r>
+      <w:proofErr w:type="spellEnd"/>
+      <w:r>
+        <w:rPr>
+          <w:lang w:val="es-ES"/>
+        </w:rPr>
+        <w:t xml:space="preserve"> (que es el contenedor de tus botones) y actualízala para que contenga estas propiedades.</w:t>
+      </w:r>
+    </w:p>
+    <w:p>
+      <w:pPr>
+        <w:pStyle w:val="NormalWeb"/>
+        <w:rPr>
+          <w:lang w:val="es-ES"/>
+        </w:rPr>
+      </w:pPr>
+      <w:r>
+        <w:rPr>
+          <w:lang w:val="es-ES"/>
+        </w:rPr>
+        <w:t>Puedes copiar y pegar este bloque exacto reemplazando el actual:</w:t>
+      </w:r>
+    </w:p>
+    <w:p>
+      <w:r>
+        <w:rPr>
+          <w:rStyle w:val="ng-tns-c416257785-162"/>
+        </w:rPr>
+        <w:t>CSS</w:t>
+      </w:r>
+    </w:p>
+    <w:p>
+      <w:pPr>
+        <w:pStyle w:val="HTMLPreformatted"/>
+        <w:rPr>
+          <w:rStyle w:val="HTMLCode"/>
+          <w:rFonts w:eastAsiaTheme="majorEastAsia"/>
+          <w:lang w:val="es-ES"/>
+        </w:rPr>
+      </w:pPr>
+      <w:r>
+        <w:rPr>
+          <w:rStyle w:val="hljs-comment"/>
+          <w:rFonts w:eastAsiaTheme="majorEastAsia"/>
+          <w:lang w:val="es-ES"/>
+        </w:rPr>
+        <w:t>/* 1. Contenedor Principal del Menú de Pestañas */</w:t>
+      </w:r>
+    </w:p>
+    <w:p>
+      <w:pPr>
+        <w:pStyle w:val="HTMLPreformatted"/>
+        <w:rPr>
+          <w:rStyle w:val="HTMLCode"/>
+          <w:rFonts w:eastAsiaTheme="majorEastAsia"/>
+        </w:rPr>
+      </w:pPr>
+      <w:proofErr w:type="gramStart"/>
+      <w:r>
+        <w:rPr>
+          <w:rStyle w:val="hljs-selector-class"/>
+        </w:rPr>
+        <w:t>.suite</w:t>
+      </w:r>
+      <w:proofErr w:type="gramEnd"/>
+      <w:r>
+        <w:rPr>
+          <w:rStyle w:val="hljs-selector-class"/>
+        </w:rPr>
+        <w:t>-tabs-modern</w:t>
+      </w:r>
+      <w:r>
+        <w:rPr>
+          <w:rStyle w:val="HTMLCode"/>
+          <w:rFonts w:eastAsiaTheme="majorEastAsia"/>
+        </w:rPr>
+        <w:t xml:space="preserve"> {</w:t>
+      </w:r>
+    </w:p>
+    <w:p>
+      <w:pPr>
+        <w:pStyle w:val="HTMLPreformatted"/>
+        <w:rPr>
+          <w:rStyle w:val="HTMLCode"/>
+          <w:rFonts w:eastAsiaTheme="majorEastAsia"/>
+        </w:rPr>
+      </w:pPr>
+      <w:r>
+        <w:rPr>
+          <w:rStyle w:val="HTMLCode"/>
+          <w:rFonts w:eastAsiaTheme="majorEastAsia"/>
+        </w:rPr>
+        <w:t xml:space="preserve">    </w:t>
+      </w:r>
+      <w:r>
+        <w:rPr>
+          <w:rStyle w:val="hljs-attribute"/>
+          <w:rFonts w:eastAsiaTheme="majorEastAsia"/>
+        </w:rPr>
+        <w:t>display</w:t>
+      </w:r>
+      <w:r>
+        <w:rPr>
+          <w:rStyle w:val="HTMLCode"/>
+          <w:rFonts w:eastAsiaTheme="majorEastAsia"/>
+        </w:rPr>
+        <w:t>: flex;</w:t>
+      </w:r>
+    </w:p>
+    <w:p>
+      <w:pPr>
+        <w:pStyle w:val="HTMLPreformatted"/>
+        <w:rPr>
+          <w:rStyle w:val="HTMLCode"/>
+          <w:rFonts w:eastAsiaTheme="majorEastAsia"/>
+          <w:lang w:val="es-ES"/>
+        </w:rPr>
+      </w:pPr>
+      <w:r>
+        <w:rPr>
+          <w:rStyle w:val="HTMLCode"/>
+          <w:rFonts w:eastAsiaTheme="majorEastAsia"/>
+        </w:rPr>
+        <w:t xml:space="preserve">    </w:t>
+      </w:r>
+      <w:proofErr w:type="spellStart"/>
+      <w:r>
+        <w:rPr>
+          <w:rStyle w:val="hljs-attribute"/>
+          <w:rFonts w:eastAsiaTheme="majorEastAsia"/>
+          <w:lang w:val="es-ES"/>
+        </w:rPr>
+        <w:t>flex-wrap</w:t>
+      </w:r>
+      <w:proofErr w:type="spellEnd"/>
+      <w:r>
+        <w:rPr>
+          <w:rStyle w:val="HTMLCode"/>
+          <w:rFonts w:eastAsiaTheme="majorEastAsia"/>
+          <w:lang w:val="es-ES"/>
+        </w:rPr>
+        <w:t xml:space="preserve">: </w:t>
+      </w:r>
+      <w:proofErr w:type="spellStart"/>
+      <w:proofErr w:type="gramStart"/>
+      <w:r>
+        <w:rPr>
+          <w:rStyle w:val="HTMLCode"/>
+          <w:rFonts w:eastAsiaTheme="majorEastAsia"/>
+          <w:lang w:val="es-ES"/>
+        </w:rPr>
+        <w:t>nowrap</w:t>
+      </w:r>
+      <w:proofErr w:type="spellEnd"/>
+      <w:r>
+        <w:rPr>
+          <w:rStyle w:val="HTMLCode"/>
+          <w:rFonts w:eastAsiaTheme="majorEastAsia"/>
+          <w:lang w:val="es-ES"/>
+        </w:rPr>
+        <w:t xml:space="preserve">;   </w:t>
+      </w:r>
+      <w:proofErr w:type="gramEnd"/>
+      <w:r>
+        <w:rPr>
+          <w:rStyle w:val="HTMLCode"/>
+          <w:rFonts w:eastAsiaTheme="majorEastAsia"/>
+          <w:lang w:val="es-ES"/>
+        </w:rPr>
+        <w:t xml:space="preserve">      </w:t>
+      </w:r>
+      <w:r>
+        <w:rPr>
+          <w:rStyle w:val="hljs-comment"/>
+          <w:rFonts w:eastAsiaTheme="majorEastAsia"/>
+          <w:lang w:val="es-ES"/>
+        </w:rPr>
+        <w:t>/* Obliga a los botones a mantenerse en una sola línea horizontal */</w:t>
+      </w:r>
+    </w:p>
+    <w:p>
+      <w:pPr>
+        <w:pStyle w:val="HTMLPreformatted"/>
+        <w:rPr>
+          <w:rStyle w:val="HTMLCode"/>
+          <w:rFonts w:eastAsiaTheme="majorEastAsia"/>
+          <w:lang w:val="es-ES"/>
+        </w:rPr>
+      </w:pPr>
+      <w:r>
+        <w:rPr>
+          <w:rStyle w:val="HTMLCode"/>
+          <w:rFonts w:eastAsiaTheme="majorEastAsia"/>
+          <w:lang w:val="es-ES"/>
+        </w:rPr>
+        <w:t xml:space="preserve">    </w:t>
+      </w:r>
+      <w:proofErr w:type="spellStart"/>
+      <w:r>
+        <w:rPr>
+          <w:rStyle w:val="hljs-attribute"/>
+          <w:rFonts w:eastAsiaTheme="majorEastAsia"/>
+          <w:lang w:val="es-ES"/>
+        </w:rPr>
+        <w:t>overflow</w:t>
+      </w:r>
+      <w:proofErr w:type="spellEnd"/>
+      <w:r>
+        <w:rPr>
+          <w:rStyle w:val="hljs-attribute"/>
+          <w:rFonts w:eastAsiaTheme="majorEastAsia"/>
+          <w:lang w:val="es-ES"/>
+        </w:rPr>
+        <w:t>-x</w:t>
+      </w:r>
+      <w:r>
+        <w:rPr>
+          <w:rStyle w:val="HTMLCode"/>
+          <w:rFonts w:eastAsiaTheme="majorEastAsia"/>
+          <w:lang w:val="es-ES"/>
+        </w:rPr>
+        <w:t xml:space="preserve">: </w:t>
+      </w:r>
+      <w:proofErr w:type="gramStart"/>
+      <w:r>
+        <w:rPr>
+          <w:rStyle w:val="HTMLCode"/>
+          <w:rFonts w:eastAsiaTheme="majorEastAsia"/>
+          <w:lang w:val="es-ES"/>
+        </w:rPr>
+        <w:t xml:space="preserve">auto;   </w:t>
+      </w:r>
+      <w:proofErr w:type="gramEnd"/>
+      <w:r>
+        <w:rPr>
+          <w:rStyle w:val="HTMLCode"/>
+          <w:rFonts w:eastAsiaTheme="majorEastAsia"/>
+          <w:lang w:val="es-ES"/>
+        </w:rPr>
+        <w:t xml:space="preserve">       </w:t>
+      </w:r>
+      <w:r>
+        <w:rPr>
+          <w:rStyle w:val="hljs-comment"/>
+          <w:rFonts w:eastAsiaTheme="majorEastAsia"/>
+          <w:lang w:val="es-ES"/>
+        </w:rPr>
+        <w:t xml:space="preserve">/* Activa el </w:t>
+      </w:r>
+      <w:proofErr w:type="spellStart"/>
+      <w:r>
+        <w:rPr>
+          <w:rStyle w:val="hljs-comment"/>
+          <w:rFonts w:eastAsiaTheme="majorEastAsia"/>
+          <w:lang w:val="es-ES"/>
+        </w:rPr>
+        <w:t>scroll</w:t>
+      </w:r>
+      <w:proofErr w:type="spellEnd"/>
+      <w:r>
+        <w:rPr>
+          <w:rStyle w:val="hljs-comment"/>
+          <w:rFonts w:eastAsiaTheme="majorEastAsia"/>
+          <w:lang w:val="es-ES"/>
+        </w:rPr>
+        <w:t xml:space="preserve"> horizontal si los botones superan el ancho de la pantalla */</w:t>
+      </w:r>
+    </w:p>
+    <w:p>
+      <w:pPr>
+        <w:pStyle w:val="HTMLPreformatted"/>
+        <w:rPr>
+          <w:rStyle w:val="HTMLCode"/>
+          <w:rFonts w:eastAsiaTheme="majorEastAsia"/>
+          <w:lang w:val="es-ES"/>
+        </w:rPr>
+      </w:pPr>
+      <w:r>
+        <w:rPr>
+          <w:rStyle w:val="HTMLCode"/>
+          <w:rFonts w:eastAsiaTheme="majorEastAsia"/>
+          <w:lang w:val="es-ES"/>
+        </w:rPr>
+        <w:t xml:space="preserve">    -webkit-</w:t>
+      </w:r>
+      <w:proofErr w:type="spellStart"/>
+      <w:r>
+        <w:rPr>
+          <w:rStyle w:val="hljs-attribute"/>
+          <w:rFonts w:eastAsiaTheme="majorEastAsia"/>
+          <w:lang w:val="es-ES"/>
+        </w:rPr>
+        <w:t>overflow</w:t>
+      </w:r>
+      <w:proofErr w:type="spellEnd"/>
+      <w:r>
+        <w:rPr>
+          <w:rStyle w:val="HTMLCode"/>
+          <w:rFonts w:eastAsiaTheme="majorEastAsia"/>
+          <w:lang w:val="es-ES"/>
+        </w:rPr>
+        <w:t>-</w:t>
+      </w:r>
+      <w:proofErr w:type="spellStart"/>
+      <w:r>
+        <w:rPr>
+          <w:rStyle w:val="HTMLCode"/>
+          <w:rFonts w:eastAsiaTheme="majorEastAsia"/>
+          <w:lang w:val="es-ES"/>
+        </w:rPr>
+        <w:t>scrolling</w:t>
+      </w:r>
+      <w:proofErr w:type="spellEnd"/>
+      <w:r>
+        <w:rPr>
+          <w:rStyle w:val="HTMLCode"/>
+          <w:rFonts w:eastAsiaTheme="majorEastAsia"/>
+          <w:lang w:val="es-ES"/>
+        </w:rPr>
+        <w:t xml:space="preserve">: </w:t>
+      </w:r>
+      <w:proofErr w:type="spellStart"/>
+      <w:r>
+        <w:rPr>
+          <w:rStyle w:val="HTMLCode"/>
+          <w:rFonts w:eastAsiaTheme="majorEastAsia"/>
+          <w:lang w:val="es-ES"/>
+        </w:rPr>
+        <w:t>touch</w:t>
+      </w:r>
+      <w:proofErr w:type="spellEnd"/>
+      <w:r>
+        <w:rPr>
+          <w:rStyle w:val="HTMLCode"/>
+          <w:rFonts w:eastAsiaTheme="majorEastAsia"/>
+          <w:lang w:val="es-ES"/>
+        </w:rPr>
+        <w:t xml:space="preserve">; </w:t>
+      </w:r>
+      <w:r>
+        <w:rPr>
+          <w:rStyle w:val="hljs-comment"/>
+          <w:rFonts w:eastAsiaTheme="majorEastAsia"/>
+          <w:lang w:val="es-ES"/>
+        </w:rPr>
+        <w:t xml:space="preserve">/* Activa el </w:t>
+      </w:r>
+      <w:proofErr w:type="spellStart"/>
+      <w:r>
+        <w:rPr>
+          <w:rStyle w:val="hljs-comment"/>
+          <w:rFonts w:eastAsiaTheme="majorEastAsia"/>
+          <w:lang w:val="es-ES"/>
+        </w:rPr>
+        <w:t>scroll</w:t>
+      </w:r>
+      <w:proofErr w:type="spellEnd"/>
+      <w:r>
+        <w:rPr>
+          <w:rStyle w:val="hljs-comment"/>
+          <w:rFonts w:eastAsiaTheme="majorEastAsia"/>
+          <w:lang w:val="es-ES"/>
+        </w:rPr>
+        <w:t xml:space="preserve"> suave (fricción nativa) en iOS/</w:t>
+      </w:r>
+      <w:proofErr w:type="spellStart"/>
+      <w:r>
+        <w:rPr>
+          <w:rStyle w:val="hljs-comment"/>
+          <w:rFonts w:eastAsiaTheme="majorEastAsia"/>
+          <w:lang w:val="es-ES"/>
+        </w:rPr>
+        <w:t>iPhones</w:t>
+      </w:r>
+      <w:proofErr w:type="spellEnd"/>
+      <w:r>
+        <w:rPr>
+          <w:rStyle w:val="hljs-comment"/>
+          <w:rFonts w:eastAsiaTheme="majorEastAsia"/>
+          <w:lang w:val="es-ES"/>
+        </w:rPr>
+        <w:t xml:space="preserve"> */</w:t>
+      </w:r>
+    </w:p>
+    <w:p>
+      <w:pPr>
+        <w:pStyle w:val="HTMLPreformatted"/>
+        <w:rPr>
+          <w:rStyle w:val="HTMLCode"/>
+          <w:rFonts w:eastAsiaTheme="majorEastAsia"/>
+          <w:lang w:val="es-ES"/>
+        </w:rPr>
+      </w:pPr>
+      <w:r>
+        <w:rPr>
+          <w:rStyle w:val="HTMLCode"/>
+          <w:rFonts w:eastAsiaTheme="majorEastAsia"/>
+          <w:lang w:val="es-ES"/>
+        </w:rPr>
+        <w:t xml:space="preserve">    gap: </w:t>
+      </w:r>
+      <w:r>
+        <w:rPr>
+          <w:rStyle w:val="hljs-number"/>
+          <w:lang w:val="es-ES"/>
+        </w:rPr>
+        <w:t>10</w:t>
+      </w:r>
+      <w:proofErr w:type="gramStart"/>
+      <w:r>
+        <w:rPr>
+          <w:rStyle w:val="hljs-number"/>
+          <w:lang w:val="es-ES"/>
+        </w:rPr>
+        <w:t>px</w:t>
+      </w:r>
+      <w:r>
+        <w:rPr>
+          <w:rStyle w:val="HTMLCode"/>
+          <w:rFonts w:eastAsiaTheme="majorEastAsia"/>
+          <w:lang w:val="es-ES"/>
+        </w:rPr>
+        <w:t xml:space="preserve">;   </w:t>
+      </w:r>
+      <w:proofErr w:type="gramEnd"/>
+      <w:r>
+        <w:rPr>
+          <w:rStyle w:val="HTMLCode"/>
+          <w:rFonts w:eastAsiaTheme="majorEastAsia"/>
+          <w:lang w:val="es-ES"/>
+        </w:rPr>
+        <w:t xml:space="preserve">              </w:t>
+      </w:r>
+      <w:r>
+        <w:rPr>
+          <w:rStyle w:val="hljs-comment"/>
+          <w:rFonts w:eastAsiaTheme="majorEastAsia"/>
+          <w:lang w:val="es-ES"/>
+        </w:rPr>
+        <w:t>/* Espaciado uniforme entre las pestañas */</w:t>
+      </w:r>
+    </w:p>
+    <w:p>
+      <w:pPr>
+        <w:pStyle w:val="HTMLPreformatted"/>
+        <w:rPr>
+          <w:rStyle w:val="HTMLCode"/>
+          <w:rFonts w:eastAsiaTheme="majorEastAsia"/>
+          <w:lang w:val="es-ES"/>
+        </w:rPr>
+      </w:pPr>
+      <w:r>
+        <w:rPr>
+          <w:rStyle w:val="HTMLCode"/>
+          <w:rFonts w:eastAsiaTheme="majorEastAsia"/>
+          <w:lang w:val="es-ES"/>
+        </w:rPr>
+        <w:t xml:space="preserve">    </w:t>
+      </w:r>
+      <w:proofErr w:type="spellStart"/>
+      <w:r>
+        <w:rPr>
+          <w:rStyle w:val="hljs-attribute"/>
+          <w:rFonts w:eastAsiaTheme="majorEastAsia"/>
+          <w:lang w:val="es-ES"/>
+        </w:rPr>
+        <w:t>padding</w:t>
+      </w:r>
+      <w:proofErr w:type="spellEnd"/>
+      <w:r>
+        <w:rPr>
+          <w:rStyle w:val="hljs-attribute"/>
+          <w:rFonts w:eastAsiaTheme="majorEastAsia"/>
+          <w:lang w:val="es-ES"/>
+        </w:rPr>
+        <w:t>-bottom</w:t>
+      </w:r>
+      <w:r>
+        <w:rPr>
+          <w:rStyle w:val="HTMLCode"/>
+          <w:rFonts w:eastAsiaTheme="majorEastAsia"/>
+          <w:lang w:val="es-ES"/>
+        </w:rPr>
+        <w:t xml:space="preserve">: </w:t>
+      </w:r>
+      <w:r>
+        <w:rPr>
+          <w:rStyle w:val="hljs-number"/>
+          <w:lang w:val="es-ES"/>
+        </w:rPr>
+        <w:t>5</w:t>
+      </w:r>
+      <w:proofErr w:type="gramStart"/>
+      <w:r>
+        <w:rPr>
+          <w:rStyle w:val="hljs-number"/>
+          <w:lang w:val="es-ES"/>
+        </w:rPr>
+        <w:t>px</w:t>
+      </w:r>
+      <w:r>
+        <w:rPr>
+          <w:rStyle w:val="HTMLCode"/>
+          <w:rFonts w:eastAsiaTheme="majorEastAsia"/>
+          <w:lang w:val="es-ES"/>
+        </w:rPr>
+        <w:t xml:space="preserve">;   </w:t>
+      </w:r>
+      <w:proofErr w:type="gramEnd"/>
+      <w:r>
+        <w:rPr>
+          <w:rStyle w:val="HTMLCode"/>
+          <w:rFonts w:eastAsiaTheme="majorEastAsia"/>
+          <w:lang w:val="es-ES"/>
+        </w:rPr>
+        <w:t xml:space="preserve">    </w:t>
+      </w:r>
+      <w:r>
+        <w:rPr>
+          <w:rStyle w:val="hljs-comment"/>
+          <w:rFonts w:eastAsiaTheme="majorEastAsia"/>
+          <w:lang w:val="es-ES"/>
+        </w:rPr>
+        <w:t>/* Pequeño margen para que la sombra de los botones respire */</w:t>
+      </w:r>
+    </w:p>
+    <w:p>
+      <w:pPr>
+        <w:pStyle w:val="HTMLPreformatted"/>
+        <w:rPr>
+          <w:rStyle w:val="HTMLCode"/>
+          <w:rFonts w:eastAsiaTheme="majorEastAsia"/>
+          <w:lang w:val="es-ES"/>
+        </w:rPr>
+      </w:pPr>
+      <w:r>
+        <w:rPr>
+          <w:rStyle w:val="HTMLCode"/>
+          <w:rFonts w:eastAsiaTheme="majorEastAsia"/>
+          <w:lang w:val="es-ES"/>
+        </w:rPr>
+        <w:t xml:space="preserve">    </w:t>
+      </w:r>
+    </w:p>
+    <w:p>
+      <w:pPr>
+        <w:pStyle w:val="HTMLPreformatted"/>
+        <w:rPr>
+          <w:rStyle w:val="HTMLCode"/>
+          <w:rFonts w:eastAsiaTheme="majorEastAsia"/>
+          <w:lang w:val="es-ES"/>
+        </w:rPr>
+      </w:pPr>
+      <w:r>
+        <w:rPr>
+          <w:rStyle w:val="HTMLCode"/>
+          <w:rFonts w:eastAsiaTheme="majorEastAsia"/>
+          <w:lang w:val="es-ES"/>
+        </w:rPr>
+        <w:t xml:space="preserve">    </w:t>
+      </w:r>
+      <w:r>
+        <w:rPr>
+          <w:rStyle w:val="hljs-comment"/>
+          <w:rFonts w:eastAsiaTheme="majorEastAsia"/>
+          <w:lang w:val="es-ES"/>
+        </w:rPr>
+        <w:t xml:space="preserve">/* Ocultar barra de </w:t>
+      </w:r>
+      <w:proofErr w:type="spellStart"/>
+      <w:r>
+        <w:rPr>
+          <w:rStyle w:val="hljs-comment"/>
+          <w:rFonts w:eastAsiaTheme="majorEastAsia"/>
+          <w:lang w:val="es-ES"/>
+        </w:rPr>
+        <w:t>scroll</w:t>
+      </w:r>
+      <w:proofErr w:type="spellEnd"/>
+      <w:r>
+        <w:rPr>
+          <w:rStyle w:val="hljs-comment"/>
+          <w:rFonts w:eastAsiaTheme="majorEastAsia"/>
+          <w:lang w:val="es-ES"/>
+        </w:rPr>
+        <w:t xml:space="preserve"> en Firefox */</w:t>
+      </w:r>
+    </w:p>
+    <w:p>
+      <w:pPr>
+        <w:pStyle w:val="HTMLPreformatted"/>
+        <w:rPr>
+          <w:rStyle w:val="HTMLCode"/>
+          <w:rFonts w:eastAsiaTheme="majorEastAsia"/>
+        </w:rPr>
+      </w:pPr>
+      <w:r>
+        <w:rPr>
+          <w:rStyle w:val="HTMLCode"/>
+          <w:rFonts w:eastAsiaTheme="majorEastAsia"/>
+          <w:lang w:val="es-ES"/>
+        </w:rPr>
+        <w:t xml:space="preserve">    </w:t>
+      </w:r>
+      <w:r>
+        <w:rPr>
+          <w:rStyle w:val="HTMLCode"/>
+          <w:rFonts w:eastAsiaTheme="majorEastAsia"/>
+        </w:rPr>
+        <w:t>scrollbar-</w:t>
+      </w:r>
+      <w:r>
+        <w:rPr>
+          <w:rStyle w:val="hljs-attribute"/>
+          <w:rFonts w:eastAsiaTheme="majorEastAsia"/>
+        </w:rPr>
+        <w:t>width</w:t>
+      </w:r>
+      <w:r>
+        <w:rPr>
+          <w:rStyle w:val="HTMLCode"/>
+          <w:rFonts w:eastAsiaTheme="majorEastAsia"/>
+        </w:rPr>
+        <w:t xml:space="preserve">: none;     </w:t>
+      </w:r>
+    </w:p>
+    <w:p>
+      <w:pPr>
+        <w:pStyle w:val="HTMLPreformatted"/>
+        <w:rPr>
+          <w:rStyle w:val="HTMLCode"/>
+          <w:rFonts w:eastAsiaTheme="majorEastAsia"/>
+        </w:rPr>
+      </w:pPr>
+      <w:r>
+        <w:rPr>
+          <w:rStyle w:val="HTMLCode"/>
+          <w:rFonts w:eastAsiaTheme="majorEastAsia"/>
+        </w:rPr>
+        <w:t xml:space="preserve">    </w:t>
+      </w:r>
+      <w:r>
+        <w:rPr>
+          <w:rStyle w:val="hljs-comment"/>
+          <w:rFonts w:eastAsiaTheme="majorEastAsia"/>
+        </w:rPr>
+        <w:t xml:space="preserve">/* </w:t>
+      </w:r>
+      <w:proofErr w:type="spellStart"/>
+      <w:r>
+        <w:rPr>
+          <w:rStyle w:val="hljs-comment"/>
+          <w:rFonts w:eastAsiaTheme="majorEastAsia"/>
+        </w:rPr>
+        <w:t>Ocultar</w:t>
+      </w:r>
+      <w:proofErr w:type="spellEnd"/>
+      <w:r>
+        <w:rPr>
+          <w:rStyle w:val="hljs-comment"/>
+          <w:rFonts w:eastAsiaTheme="majorEastAsia"/>
+        </w:rPr>
+        <w:t xml:space="preserve"> </w:t>
+      </w:r>
+      <w:proofErr w:type="spellStart"/>
+      <w:r>
+        <w:rPr>
+          <w:rStyle w:val="hljs-comment"/>
+          <w:rFonts w:eastAsiaTheme="majorEastAsia"/>
+        </w:rPr>
+        <w:t>barra</w:t>
+      </w:r>
+      <w:proofErr w:type="spellEnd"/>
+      <w:r>
+        <w:rPr>
+          <w:rStyle w:val="hljs-comment"/>
+          <w:rFonts w:eastAsiaTheme="majorEastAsia"/>
+        </w:rPr>
+        <w:t xml:space="preserve"> de scroll </w:t>
+      </w:r>
+      <w:proofErr w:type="spellStart"/>
+      <w:r>
+        <w:rPr>
+          <w:rStyle w:val="hljs-comment"/>
+          <w:rFonts w:eastAsiaTheme="majorEastAsia"/>
+        </w:rPr>
+        <w:t>en</w:t>
+      </w:r>
+      <w:proofErr w:type="spellEnd"/>
+      <w:r>
+        <w:rPr>
+          <w:rStyle w:val="hljs-comment"/>
+          <w:rFonts w:eastAsiaTheme="majorEastAsia"/>
+        </w:rPr>
+        <w:t xml:space="preserve"> IE/Edge </w:t>
+      </w:r>
+      <w:proofErr w:type="spellStart"/>
+      <w:r>
+        <w:rPr>
+          <w:rStyle w:val="hljs-comment"/>
+          <w:rFonts w:eastAsiaTheme="majorEastAsia"/>
+        </w:rPr>
+        <w:t>antiguo</w:t>
+      </w:r>
+      <w:proofErr w:type="spellEnd"/>
+      <w:r>
+        <w:rPr>
+          <w:rStyle w:val="hljs-comment"/>
+          <w:rFonts w:eastAsiaTheme="majorEastAsia"/>
+        </w:rPr>
+        <w:t xml:space="preserve"> */</w:t>
+      </w:r>
+    </w:p>
+    <w:p>
+      <w:pPr>
+        <w:pStyle w:val="HTMLPreformatted"/>
+        <w:rPr>
+          <w:rStyle w:val="HTMLCode"/>
+          <w:rFonts w:eastAsiaTheme="majorEastAsia"/>
+        </w:rPr>
+      </w:pPr>
+      <w:r>
+        <w:rPr>
+          <w:rStyle w:val="HTMLCode"/>
+          <w:rFonts w:eastAsiaTheme="majorEastAsia"/>
+        </w:rPr>
+        <w:t xml:space="preserve">    -</w:t>
+      </w:r>
+      <w:proofErr w:type="spellStart"/>
+      <w:r>
+        <w:rPr>
+          <w:rStyle w:val="HTMLCode"/>
+          <w:rFonts w:eastAsiaTheme="majorEastAsia"/>
+        </w:rPr>
+        <w:t>ms</w:t>
+      </w:r>
+      <w:proofErr w:type="spellEnd"/>
+      <w:r>
+        <w:rPr>
+          <w:rStyle w:val="HTMLCode"/>
+          <w:rFonts w:eastAsiaTheme="majorEastAsia"/>
+        </w:rPr>
+        <w:t>-</w:t>
+      </w:r>
+      <w:r>
+        <w:rPr>
+          <w:rStyle w:val="hljs-attribute"/>
+          <w:rFonts w:eastAsiaTheme="majorEastAsia"/>
+        </w:rPr>
+        <w:t>overflow</w:t>
+      </w:r>
+      <w:r>
+        <w:rPr>
+          <w:rStyle w:val="HTMLCode"/>
+          <w:rFonts w:eastAsiaTheme="majorEastAsia"/>
+        </w:rPr>
+        <w:t xml:space="preserve">-style: none;  </w:t>
+      </w:r>
+    </w:p>
+    <w:p>
+      <w:pPr>
+        <w:pStyle w:val="HTMLPreformatted"/>
+        <w:rPr>
+          <w:rStyle w:val="HTMLCode"/>
+          <w:rFonts w:eastAsiaTheme="majorEastAsia"/>
+          <w:lang w:val="es-ES"/>
+        </w:rPr>
+      </w:pPr>
+      <w:r>
+        <w:rPr>
+          <w:rStyle w:val="HTMLCode"/>
+          <w:rFonts w:eastAsiaTheme="majorEastAsia"/>
+          <w:lang w:val="es-ES"/>
+        </w:rPr>
+        <w:t>}</w:t>
+      </w:r>
+    </w:p>
+    <w:p>
+      <w:pPr>
+        <w:pStyle w:val="HTMLPreformatted"/>
+        <w:rPr>
+          <w:rStyle w:val="HTMLCode"/>
+          <w:rFonts w:eastAsiaTheme="majorEastAsia"/>
+          <w:lang w:val="es-ES"/>
+        </w:rPr>
+      </w:pPr>
+    </w:p>
+    <w:p>
+      <w:pPr>
+        <w:pStyle w:val="HTMLPreformatted"/>
+        <w:rPr>
+          <w:rStyle w:val="HTMLCode"/>
+          <w:rFonts w:eastAsiaTheme="majorEastAsia"/>
+          <w:lang w:val="es-ES"/>
+        </w:rPr>
+      </w:pPr>
+      <w:r>
+        <w:rPr>
+          <w:rStyle w:val="hljs-comment"/>
+          <w:rFonts w:eastAsiaTheme="majorEastAsia"/>
+          <w:lang w:val="es-ES"/>
+        </w:rPr>
+        <w:t xml:space="preserve">/* 2. Ocultar la barra de </w:t>
+      </w:r>
+      <w:proofErr w:type="spellStart"/>
+      <w:r>
+        <w:rPr>
+          <w:rStyle w:val="hljs-comment"/>
+          <w:rFonts w:eastAsiaTheme="majorEastAsia"/>
+          <w:lang w:val="es-ES"/>
+        </w:rPr>
+        <w:t>scroll</w:t>
+      </w:r>
+      <w:proofErr w:type="spellEnd"/>
+      <w:r>
+        <w:rPr>
+          <w:rStyle w:val="hljs-comment"/>
+          <w:rFonts w:eastAsiaTheme="majorEastAsia"/>
+          <w:lang w:val="es-ES"/>
+        </w:rPr>
+        <w:t xml:space="preserve"> en Chrome, Safari y Edge (Magia visual) */</w:t>
+      </w:r>
+    </w:p>
+    <w:p>
+      <w:pPr>
+        <w:pStyle w:val="HTMLPreformatted"/>
+        <w:rPr>
+          <w:rStyle w:val="HTMLCode"/>
+          <w:rFonts w:eastAsiaTheme="majorEastAsia"/>
+        </w:rPr>
+      </w:pPr>
+      <w:proofErr w:type="gramStart"/>
+      <w:r>
+        <w:rPr>
+          <w:rStyle w:val="hljs-selector-class"/>
+        </w:rPr>
+        <w:t>.suite</w:t>
+      </w:r>
+      <w:proofErr w:type="gramEnd"/>
+      <w:r>
+        <w:rPr>
+          <w:rStyle w:val="hljs-selector-class"/>
+        </w:rPr>
+        <w:t>-tabs-modern</w:t>
+      </w:r>
+      <w:r>
+        <w:rPr>
+          <w:rStyle w:val="HTMLCode"/>
+          <w:rFonts w:eastAsiaTheme="majorEastAsia"/>
+        </w:rPr>
+        <w:t>::-</w:t>
+      </w:r>
+      <w:proofErr w:type="spellStart"/>
+      <w:r>
+        <w:rPr>
+          <w:rStyle w:val="HTMLCode"/>
+          <w:rFonts w:eastAsiaTheme="majorEastAsia"/>
+        </w:rPr>
+        <w:t>webkit</w:t>
+      </w:r>
+      <w:proofErr w:type="spellEnd"/>
+      <w:r>
+        <w:rPr>
+          <w:rStyle w:val="HTMLCode"/>
+          <w:rFonts w:eastAsiaTheme="majorEastAsia"/>
+        </w:rPr>
+        <w:t>-scrollbar {</w:t>
+      </w:r>
+    </w:p>
+    <w:p>
+      <w:pPr>
+        <w:pStyle w:val="HTMLPreformatted"/>
+        <w:rPr>
+          <w:rStyle w:val="HTMLCode"/>
+          <w:rFonts w:eastAsiaTheme="majorEastAsia"/>
+          <w:lang w:val="es-ES"/>
+        </w:rPr>
+      </w:pPr>
+      <w:r>
+        <w:rPr>
+          <w:rStyle w:val="HTMLCode"/>
+          <w:rFonts w:eastAsiaTheme="majorEastAsia"/>
+        </w:rPr>
+        <w:t xml:space="preserve">    </w:t>
+      </w:r>
+      <w:proofErr w:type="spellStart"/>
+      <w:r>
+        <w:rPr>
+          <w:rStyle w:val="HTMLCode"/>
+          <w:rFonts w:eastAsiaTheme="majorEastAsia"/>
+          <w:lang w:val="es-ES"/>
+        </w:rPr>
+        <w:t>display</w:t>
+      </w:r>
+      <w:proofErr w:type="spellEnd"/>
+      <w:r>
+        <w:rPr>
+          <w:rStyle w:val="HTMLCode"/>
+          <w:rFonts w:eastAsiaTheme="majorEastAsia"/>
+          <w:lang w:val="es-ES"/>
+        </w:rPr>
+        <w:t xml:space="preserve">: </w:t>
+      </w:r>
+      <w:proofErr w:type="spellStart"/>
+      <w:r>
+        <w:rPr>
+          <w:rStyle w:val="HTMLCode"/>
+          <w:rFonts w:eastAsiaTheme="majorEastAsia"/>
+          <w:lang w:val="es-ES"/>
+        </w:rPr>
+        <w:t>none</w:t>
+      </w:r>
+      <w:proofErr w:type="spellEnd"/>
+      <w:r>
+        <w:rPr>
+          <w:rStyle w:val="HTMLCode"/>
+          <w:rFonts w:eastAsiaTheme="majorEastAsia"/>
+          <w:lang w:val="es-ES"/>
+        </w:rPr>
+        <w:t>;</w:t>
+      </w:r>
+    </w:p>
+    <w:p>
+      <w:pPr>
+        <w:pStyle w:val="HTMLPreformatted"/>
+        <w:rPr>
+          <w:rStyle w:val="HTMLCode"/>
+          <w:rFonts w:eastAsiaTheme="majorEastAsia"/>
+          <w:lang w:val="es-ES"/>
+        </w:rPr>
+      </w:pPr>
+      <w:r>
+        <w:rPr>
+          <w:rStyle w:val="HTMLCode"/>
+          <w:rFonts w:eastAsiaTheme="majorEastAsia"/>
+          <w:lang w:val="es-ES"/>
+        </w:rPr>
+        <w:t>}</w:t>
+      </w:r>
+    </w:p>
+    <w:p>
+      <w:pPr>
+        <w:pStyle w:val="HTMLPreformatted"/>
+        <w:rPr>
+          <w:rStyle w:val="HTMLCode"/>
+          <w:rFonts w:eastAsiaTheme="majorEastAsia"/>
+          <w:lang w:val="es-ES"/>
+        </w:rPr>
+      </w:pPr>
+    </w:p>
+    <w:p>
+      <w:pPr>
+        <w:pStyle w:val="HTMLPreformatted"/>
+        <w:rPr>
+          <w:rStyle w:val="HTMLCode"/>
+          <w:rFonts w:eastAsiaTheme="majorEastAsia"/>
+          <w:lang w:val="es-ES"/>
+        </w:rPr>
+      </w:pPr>
+      <w:r>
+        <w:rPr>
+          <w:rStyle w:val="hljs-comment"/>
+          <w:rFonts w:eastAsiaTheme="majorEastAsia"/>
+          <w:lang w:val="es-ES"/>
+        </w:rPr>
+        <w:t>/* 3. Protección para los Botones Internos */</w:t>
+      </w:r>
+    </w:p>
+    <w:p>
+      <w:pPr>
+        <w:pStyle w:val="HTMLPreformatted"/>
+        <w:rPr>
+          <w:rStyle w:val="HTMLCode"/>
+          <w:rFonts w:eastAsiaTheme="majorEastAsia"/>
+        </w:rPr>
+      </w:pPr>
+      <w:proofErr w:type="gramStart"/>
+      <w:r>
+        <w:rPr>
+          <w:rStyle w:val="hljs-selector-class"/>
+        </w:rPr>
+        <w:t>.suite</w:t>
+      </w:r>
+      <w:proofErr w:type="gramEnd"/>
+      <w:r>
+        <w:rPr>
+          <w:rStyle w:val="hljs-selector-class"/>
+        </w:rPr>
+        <w:t>-tabs-modern</w:t>
+      </w:r>
+      <w:r>
+        <w:rPr>
+          <w:rStyle w:val="HTMLCode"/>
+          <w:rFonts w:eastAsiaTheme="majorEastAsia"/>
+        </w:rPr>
+        <w:t xml:space="preserve"> </w:t>
+      </w:r>
+      <w:r>
+        <w:rPr>
+          <w:rStyle w:val="hljs-selector-class"/>
+        </w:rPr>
+        <w:t>.tab-</w:t>
+      </w:r>
+      <w:proofErr w:type="spellStart"/>
+      <w:r>
+        <w:rPr>
+          <w:rStyle w:val="hljs-selector-class"/>
+        </w:rPr>
+        <w:t>btn</w:t>
+      </w:r>
+      <w:proofErr w:type="spellEnd"/>
+      <w:r>
+        <w:rPr>
+          <w:rStyle w:val="HTMLCode"/>
+          <w:rFonts w:eastAsiaTheme="majorEastAsia"/>
+        </w:rPr>
+        <w:t xml:space="preserve"> {</w:t>
+      </w:r>
+    </w:p>
+    <w:p>
+      <w:pPr>
+        <w:pStyle w:val="HTMLPreformatted"/>
+        <w:rPr>
+          <w:rStyle w:val="HTMLCode"/>
+          <w:rFonts w:eastAsiaTheme="majorEastAsia"/>
+          <w:lang w:val="es-ES"/>
+        </w:rPr>
+      </w:pPr>
+      <w:r>
+        <w:rPr>
+          <w:rStyle w:val="HTMLCode"/>
+          <w:rFonts w:eastAsiaTheme="majorEastAsia"/>
+        </w:rPr>
+        <w:t xml:space="preserve">    </w:t>
+      </w:r>
+      <w:proofErr w:type="spellStart"/>
+      <w:r>
+        <w:rPr>
+          <w:rStyle w:val="hljs-attribute"/>
+          <w:rFonts w:eastAsiaTheme="majorEastAsia"/>
+          <w:lang w:val="es-ES"/>
+        </w:rPr>
+        <w:t>flex-shrink</w:t>
+      </w:r>
+      <w:proofErr w:type="spellEnd"/>
+      <w:r>
+        <w:rPr>
+          <w:rStyle w:val="HTMLCode"/>
+          <w:rFonts w:eastAsiaTheme="majorEastAsia"/>
+          <w:lang w:val="es-ES"/>
+        </w:rPr>
+        <w:t xml:space="preserve">: </w:t>
+      </w:r>
+      <w:proofErr w:type="gramStart"/>
+      <w:r>
+        <w:rPr>
+          <w:rStyle w:val="hljs-number"/>
+          <w:lang w:val="es-ES"/>
+        </w:rPr>
+        <w:t>0</w:t>
+      </w:r>
+      <w:r>
+        <w:rPr>
+          <w:rStyle w:val="HTMLCode"/>
+          <w:rFonts w:eastAsiaTheme="majorEastAsia"/>
+          <w:lang w:val="es-ES"/>
+        </w:rPr>
+        <w:t xml:space="preserve">;   </w:t>
+      </w:r>
+      <w:proofErr w:type="gramEnd"/>
+      <w:r>
+        <w:rPr>
+          <w:rStyle w:val="HTMLCode"/>
+          <w:rFonts w:eastAsiaTheme="majorEastAsia"/>
+          <w:lang w:val="es-ES"/>
+        </w:rPr>
+        <w:t xml:space="preserve">         </w:t>
+      </w:r>
+      <w:r>
+        <w:rPr>
+          <w:rStyle w:val="hljs-comment"/>
+          <w:rFonts w:eastAsiaTheme="majorEastAsia"/>
+          <w:lang w:val="es-ES"/>
+        </w:rPr>
+        <w:t>/* Evita que el navegador intente "aplastar" o encoger los botones */</w:t>
+      </w:r>
+    </w:p>
+    <w:p>
+      <w:pPr>
+        <w:pStyle w:val="HTMLPreformatted"/>
+        <w:rPr>
+          <w:rStyle w:val="HTMLCode"/>
+          <w:rFonts w:eastAsiaTheme="majorEastAsia"/>
+          <w:lang w:val="es-ES"/>
+        </w:rPr>
+      </w:pPr>
+      <w:r>
+        <w:rPr>
+          <w:rStyle w:val="HTMLCode"/>
+          <w:rFonts w:eastAsiaTheme="majorEastAsia"/>
+          <w:lang w:val="es-ES"/>
+        </w:rPr>
+        <w:t xml:space="preserve">    </w:t>
+      </w:r>
+      <w:proofErr w:type="spellStart"/>
+      <w:r>
+        <w:rPr>
+          <w:rStyle w:val="hljs-attribute"/>
+          <w:rFonts w:eastAsiaTheme="majorEastAsia"/>
+          <w:lang w:val="es-ES"/>
+        </w:rPr>
+        <w:t>white-space</w:t>
+      </w:r>
+      <w:proofErr w:type="spellEnd"/>
+      <w:r>
+        <w:rPr>
+          <w:rStyle w:val="HTMLCode"/>
+          <w:rFonts w:eastAsiaTheme="majorEastAsia"/>
+          <w:lang w:val="es-ES"/>
+        </w:rPr>
+        <w:t xml:space="preserve">: </w:t>
+      </w:r>
+      <w:proofErr w:type="spellStart"/>
+      <w:proofErr w:type="gramStart"/>
+      <w:r>
+        <w:rPr>
+          <w:rStyle w:val="HTMLCode"/>
+          <w:rFonts w:eastAsiaTheme="majorEastAsia"/>
+          <w:lang w:val="es-ES"/>
+        </w:rPr>
+        <w:t>nowrap</w:t>
+      </w:r>
+      <w:proofErr w:type="spellEnd"/>
+      <w:r>
+        <w:rPr>
+          <w:rStyle w:val="HTMLCode"/>
+          <w:rFonts w:eastAsiaTheme="majorEastAsia"/>
+          <w:lang w:val="es-ES"/>
+        </w:rPr>
+        <w:t xml:space="preserve">;   </w:t>
+      </w:r>
+      <w:proofErr w:type="gramEnd"/>
+      <w:r>
+        <w:rPr>
+          <w:rStyle w:val="HTMLCode"/>
+          <w:rFonts w:eastAsiaTheme="majorEastAsia"/>
+          <w:lang w:val="es-ES"/>
+        </w:rPr>
+        <w:t xml:space="preserve">    </w:t>
+      </w:r>
+      <w:r>
+        <w:rPr>
+          <w:rStyle w:val="hljs-comment"/>
+          <w:rFonts w:eastAsiaTheme="majorEastAsia"/>
+          <w:lang w:val="es-ES"/>
+        </w:rPr>
+        <w:t>/* Mantiene el texto del botón (</w:t>
+      </w:r>
+      <w:proofErr w:type="spellStart"/>
+      <w:r>
+        <w:rPr>
+          <w:rStyle w:val="hljs-comment"/>
+          <w:rFonts w:eastAsiaTheme="majorEastAsia"/>
+          <w:lang w:val="es-ES"/>
+        </w:rPr>
+        <w:t>ej</w:t>
+      </w:r>
+      <w:proofErr w:type="spellEnd"/>
+      <w:r>
+        <w:rPr>
+          <w:rStyle w:val="hljs-comment"/>
+          <w:rFonts w:eastAsiaTheme="majorEastAsia"/>
+          <w:lang w:val="es-ES"/>
+        </w:rPr>
+        <w:t>: "</w:t>
+      </w:r>
+      <w:r>
+        <w:rPr>
+          <w:rStyle w:val="hljs-comment"/>
+          <w:rFonts w:ascii="Segoe UI Emoji" w:eastAsiaTheme="majorEastAsia" w:hAnsi="Segoe UI Emoji" w:cs="Segoe UI Emoji"/>
+        </w:rPr>
+        <w:t>📈</w:t>
+      </w:r>
+      <w:r>
+        <w:rPr>
+          <w:rStyle w:val="hljs-comment"/>
+          <w:rFonts w:eastAsiaTheme="majorEastAsia"/>
+          <w:lang w:val="es-ES"/>
+        </w:rPr>
+        <w:t xml:space="preserve"> BI &amp; Marketing") en una sola línea siempre */</w:t>
+      </w:r>
+    </w:p>
+    <w:p>
+      <w:pPr>
+        <w:pStyle w:val="HTMLPreformatted"/>
+        <w:rPr>
+          <w:rStyle w:val="HTMLCode"/>
+          <w:rFonts w:eastAsiaTheme="majorEastAsia"/>
+          <w:lang w:val="es-ES"/>
+        </w:rPr>
+      </w:pPr>
+      <w:r>
+        <w:rPr>
+          <w:rStyle w:val="HTMLCode"/>
+          <w:rFonts w:eastAsiaTheme="majorEastAsia"/>
+          <w:lang w:val="es-ES"/>
+        </w:rPr>
+        <w:t>}</w:t>
+      </w:r>
+    </w:p>
+    <w:p>
+      <w:pPr>
+        <w:pStyle w:val="Heading3"/>
+      </w:pPr>
+      <w:r>
+        <w:rPr>
+          <w:rFonts w:ascii="Segoe UI Emoji" w:hAnsi="Segoe UI Emoji" w:cs="Segoe UI Emoji"/>
+        </w:rPr>
+        <w:lastRenderedPageBreak/>
+        <w:t>💡</w:t>
+      </w:r>
+      <w:r>
+        <w:t xml:space="preserve"> ¿Por qué funciona esto tan bien?</w:t>
+      </w:r>
+    </w:p>
+    <w:p>
+      <w:pPr>
+        <w:pStyle w:val="NormalWeb"/>
+        <w:numPr>
+          <w:ilvl w:val="0"/>
+          <w:numId w:val="24"/>
+        </w:numPr>
+        <w:rPr>
+          <w:lang w:val="es-ES"/>
+        </w:rPr>
+      </w:pPr>
+      <w:proofErr w:type="spellStart"/>
+      <w:r>
+        <w:rPr>
+          <w:rStyle w:val="HTMLCode"/>
+          <w:rFonts w:eastAsiaTheme="majorEastAsia"/>
+          <w:b/>
+          <w:bCs/>
+          <w:lang w:val="es-ES"/>
+        </w:rPr>
+        <w:t>flex-shrink</w:t>
+      </w:r>
+      <w:proofErr w:type="spellEnd"/>
+      <w:r>
+        <w:rPr>
+          <w:rStyle w:val="HTMLCode"/>
+          <w:rFonts w:eastAsiaTheme="majorEastAsia"/>
+          <w:b/>
+          <w:bCs/>
+          <w:lang w:val="es-ES"/>
+        </w:rPr>
+        <w:t xml:space="preserve">: </w:t>
+      </w:r>
+      <w:proofErr w:type="gramStart"/>
+      <w:r>
+        <w:rPr>
+          <w:rStyle w:val="HTMLCode"/>
+          <w:rFonts w:eastAsiaTheme="majorEastAsia"/>
+          <w:b/>
+          <w:bCs/>
+          <w:lang w:val="es-ES"/>
+        </w:rPr>
+        <w:t>0;</w:t>
+      </w:r>
+      <w:r>
+        <w:rPr>
+          <w:lang w:val="es-ES"/>
+        </w:rPr>
+        <w:t>:</w:t>
+      </w:r>
+      <w:proofErr w:type="gramEnd"/>
+      <w:r>
+        <w:rPr>
+          <w:lang w:val="es-ES"/>
+        </w:rPr>
+        <w:t xml:space="preserve"> Es el salvavidas. Le dice al navegador: </w:t>
+      </w:r>
+      <w:r>
+        <w:rPr>
+          <w:i/>
+          <w:iCs/>
+          <w:lang w:val="es-ES"/>
+        </w:rPr>
+        <w:t>"Respeta el tamaño original del botón, no me importa si la pantalla es de 300px de ancho"</w:t>
+      </w:r>
+      <w:r>
+        <w:rPr>
+          <w:lang w:val="es-ES"/>
+        </w:rPr>
+        <w:t>.</w:t>
+      </w:r>
+    </w:p>
+    <w:p>
+      <w:pPr>
+        <w:pStyle w:val="NormalWeb"/>
+        <w:numPr>
+          <w:ilvl w:val="0"/>
+          <w:numId w:val="24"/>
+        </w:numPr>
+        <w:rPr>
+          <w:lang w:val="es-ES"/>
+        </w:rPr>
+      </w:pPr>
+      <w:r>
+        <w:rPr>
+          <w:b/>
+          <w:bCs/>
+          <w:lang w:val="es-ES"/>
+        </w:rPr>
+        <w:t xml:space="preserve">Los </w:t>
+      </w:r>
+      <w:proofErr w:type="spellStart"/>
+      <w:r>
+        <w:rPr>
+          <w:b/>
+          <w:bCs/>
+          <w:lang w:val="es-ES"/>
+        </w:rPr>
+        <w:t>pseudo-</w:t>
+      </w:r>
+      <w:proofErr w:type="gramStart"/>
+      <w:r>
+        <w:rPr>
+          <w:b/>
+          <w:bCs/>
+          <w:lang w:val="es-ES"/>
+        </w:rPr>
+        <w:t>elementos</w:t>
+      </w:r>
+      <w:proofErr w:type="spellEnd"/>
+      <w:r>
+        <w:rPr>
+          <w:b/>
+          <w:bCs/>
+          <w:lang w:val="es-ES"/>
+        </w:rPr>
+        <w:t xml:space="preserve"> </w:t>
+      </w:r>
+      <w:r>
+        <w:rPr>
+          <w:rStyle w:val="HTMLCode"/>
+          <w:rFonts w:eastAsiaTheme="majorEastAsia"/>
+          <w:b/>
+          <w:bCs/>
+          <w:lang w:val="es-ES"/>
+        </w:rPr>
+        <w:t>::-</w:t>
+      </w:r>
+      <w:proofErr w:type="gramEnd"/>
+      <w:r>
+        <w:rPr>
+          <w:rStyle w:val="HTMLCode"/>
+          <w:rFonts w:eastAsiaTheme="majorEastAsia"/>
+          <w:b/>
+          <w:bCs/>
+          <w:lang w:val="es-ES"/>
+        </w:rPr>
+        <w:t>webkit-</w:t>
+      </w:r>
+      <w:proofErr w:type="spellStart"/>
+      <w:r>
+        <w:rPr>
+          <w:rStyle w:val="HTMLCode"/>
+          <w:rFonts w:eastAsiaTheme="majorEastAsia"/>
+          <w:b/>
+          <w:bCs/>
+          <w:lang w:val="es-ES"/>
+        </w:rPr>
+        <w:t>scrollbar</w:t>
+      </w:r>
+      <w:proofErr w:type="spellEnd"/>
+      <w:r>
+        <w:rPr>
+          <w:lang w:val="es-ES"/>
+        </w:rPr>
+        <w:t>: Son los responsables de que la interfaz se vea premium. Al ocultar la barra gris, el usuario intuitivamente sabrá que puede deslizar el dedo sobre los botones, igual que en Instagram o YouTube.</w:t>
+      </w:r>
+    </w:p>
+    <w:p>
+      <w:pPr>
+        <w:rPr>
+          <w:rFonts w:ascii="Segoe UI Emoji" w:hAnsi="Segoe UI Emoji" w:cs="Segoe UI Emoji"/>
+          <w:b/>
+          <w:bCs/>
+          <w:lang w:val="es-ES"/>
+        </w:rPr>
+      </w:pPr>
+    </w:p>
+    <w:p>
+      <w:pPr>
+        <w:rPr>
+          <w:rFonts w:ascii="Segoe UI Emoji" w:hAnsi="Segoe UI Emoji" w:cs="Segoe UI Emoji"/>
+          <w:b/>
+          <w:bCs/>
+        </w:rPr>
+      </w:pPr>
+    </w:p>
+    <w:p>
+      <w:pPr>
         <w:rPr>
           <w:b/>
           <w:bCs/>
@@ -337,6 +1955,7 @@
         <w:rPr>
           <w:rFonts w:ascii="Segoe UI Emoji" w:hAnsi="Segoe UI Emoji" w:cs="Segoe UI Emoji"/>
         </w:rPr>
+        <w:lastRenderedPageBreak/>
         <w:t>🟢</w:t>
       </w:r>
       <w:r>
@@ -492,7 +2111,6 @@
         </w:numPr>
       </w:pPr>
       <w:r>
-        <w:lastRenderedPageBreak/>
         <w:t xml:space="preserve">Cuando la ficha entra a </w:t>
       </w:r>
       <w:r>
@@ -782,6 +2400,7 @@
         </w:numPr>
       </w:pPr>
       <w:r>
+        <w:lastRenderedPageBreak/>
         <w:t xml:space="preserve">El Administrador contará con un botón de </w:t>
       </w:r>
       <w:r>
@@ -1026,6 +2645,7 @@
           <w:b/>
           <w:bCs/>
         </w:rPr>
+        <w:lastRenderedPageBreak/>
         <w:t>Aplicar estilo a la tabla de clientes. La columna “</w:t>
       </w:r>
       <w:proofErr w:type="spellStart"/>
@@ -1252,7 +2872,6 @@
           <w:b/>
           <w:bCs/>
         </w:rPr>
-        <w:lastRenderedPageBreak/>
         <w:t>Las fichas de la columna “</w:t>
       </w:r>
       <w:r>
@@ -1727,6 +3346,7 @@
       </w:pPr>
       <w:proofErr w:type="gramStart"/>
       <w:r>
+        <w:lastRenderedPageBreak/>
         <w:t xml:space="preserve">Quiero saber </w:t>
       </w:r>
       <w:proofErr w:type="spellStart"/>
@@ -1833,7 +3453,6 @@
           <w:sz w:val="52"/>
           <w:szCs w:val="52"/>
         </w:rPr>
-        <w:lastRenderedPageBreak/>
         <w:t>🏛</w:t>
       </w:r>
       <w:r>
@@ -1844,226 +3463,6 @@
           <w:szCs w:val="52"/>
         </w:rPr>
         <w:t>️ PLAN MAESTRO: SUITE EMPLEADOS V26</w:t>
-      </w:r>
-    </w:p>
-    <w:p>
-      <w:pPr>
-        <w:pStyle w:val="Heading4"/>
-      </w:pPr>
-      <w:r>
-        <w:rPr>
-          <w:rFonts w:ascii="Segoe UI Emoji" w:hAnsi="Segoe UI Emoji" w:cs="Segoe UI Emoji"/>
-        </w:rPr>
-        <w:t>📍</w:t>
-      </w:r>
-      <w:r>
-        <w:t xml:space="preserve"> FASE 1: UI / UX (El "Quick </w:t>
-      </w:r>
-      <w:proofErr w:type="spellStart"/>
-      <w:r>
-        <w:t>Win</w:t>
-      </w:r>
-      <w:proofErr w:type="spellEnd"/>
-      <w:r>
-        <w:t>" Matutino)</w:t>
-      </w:r>
-    </w:p>
-    <w:p>
-      <w:pPr>
-        <w:pStyle w:val="NormalWeb"/>
-        <w:rPr>
-          <w:lang w:val="es-ES"/>
-        </w:rPr>
-      </w:pPr>
-      <w:r>
-        <w:rPr>
-          <w:i/>
-          <w:iCs/>
-          <w:lang w:val="es-ES"/>
-        </w:rPr>
-        <w:t xml:space="preserve">Objetivo: Resolver la navegación en móviles y </w:t>
-      </w:r>
-      <w:proofErr w:type="spellStart"/>
-      <w:r>
-        <w:rPr>
-          <w:i/>
-          <w:iCs/>
-          <w:lang w:val="es-ES"/>
-        </w:rPr>
-        <w:t>tablets</w:t>
-      </w:r>
-      <w:proofErr w:type="spellEnd"/>
-      <w:r>
-        <w:rPr>
-          <w:i/>
-          <w:iCs/>
-          <w:lang w:val="es-ES"/>
-        </w:rPr>
-        <w:t xml:space="preserve"> antes de agregar más módulos.</w:t>
-      </w:r>
-    </w:p>
-    <w:p>
-      <w:pPr>
-        <w:pStyle w:val="NormalWeb"/>
-        <w:numPr>
-          <w:ilvl w:val="0"/>
-          <w:numId w:val="31"/>
-        </w:numPr>
-        <w:rPr>
-          <w:lang w:val="es-ES"/>
-        </w:rPr>
-      </w:pPr>
-      <w:r>
-        <w:rPr>
-          <w:b/>
-          <w:bCs/>
-          <w:lang w:val="es-ES"/>
-        </w:rPr>
-        <w:t>1.1. Menú Móvil Deslizable (</w:t>
-      </w:r>
-      <w:proofErr w:type="spellStart"/>
-      <w:r>
-        <w:rPr>
-          <w:b/>
-          <w:bCs/>
-          <w:lang w:val="es-ES"/>
-        </w:rPr>
-        <w:t>Swipe</w:t>
-      </w:r>
-      <w:proofErr w:type="spellEnd"/>
-      <w:r>
-        <w:rPr>
-          <w:b/>
-          <w:bCs/>
-          <w:lang w:val="es-ES"/>
-        </w:rPr>
-        <w:t>):</w:t>
-      </w:r>
-      <w:r>
-        <w:rPr>
-          <w:lang w:val="es-ES"/>
-        </w:rPr>
-        <w:t xml:space="preserve"> Aplicar el código CSS (</w:t>
-      </w:r>
-      <w:proofErr w:type="spellStart"/>
-      <w:r>
-        <w:rPr>
-          <w:rStyle w:val="HTMLCode"/>
-          <w:rFonts w:eastAsiaTheme="majorEastAsia"/>
-          <w:lang w:val="es-ES"/>
-        </w:rPr>
-        <w:t>overflow</w:t>
-      </w:r>
-      <w:proofErr w:type="spellEnd"/>
-      <w:r>
-        <w:rPr>
-          <w:rStyle w:val="HTMLCode"/>
-          <w:rFonts w:eastAsiaTheme="majorEastAsia"/>
-          <w:lang w:val="es-ES"/>
-        </w:rPr>
-        <w:t>-x: auto</w:t>
-      </w:r>
-      <w:r>
-        <w:rPr>
-          <w:lang w:val="es-ES"/>
-        </w:rPr>
-        <w:t xml:space="preserve"> y </w:t>
-      </w:r>
-      <w:proofErr w:type="spellStart"/>
-      <w:r>
-        <w:rPr>
-          <w:rStyle w:val="HTMLCode"/>
-          <w:rFonts w:eastAsiaTheme="majorEastAsia"/>
-          <w:lang w:val="es-ES"/>
-        </w:rPr>
-        <w:t>flex-shrink</w:t>
-      </w:r>
-      <w:proofErr w:type="spellEnd"/>
-      <w:r>
-        <w:rPr>
-          <w:rStyle w:val="HTMLCode"/>
-          <w:rFonts w:eastAsiaTheme="majorEastAsia"/>
-          <w:lang w:val="es-ES"/>
-        </w:rPr>
-        <w:t>: 0</w:t>
-      </w:r>
-      <w:r>
-        <w:rPr>
-          <w:lang w:val="es-ES"/>
-        </w:rPr>
-        <w:t xml:space="preserve">) al </w:t>
-      </w:r>
-      <w:proofErr w:type="gramStart"/>
-      <w:r>
-        <w:rPr>
-          <w:lang w:val="es-ES"/>
-        </w:rPr>
-        <w:t xml:space="preserve">contenedor </w:t>
-      </w:r>
-      <w:r>
-        <w:rPr>
-          <w:rStyle w:val="HTMLCode"/>
-          <w:rFonts w:eastAsiaTheme="majorEastAsia"/>
-          <w:lang w:val="es-ES"/>
-        </w:rPr>
-        <w:t>.suite</w:t>
-      </w:r>
-      <w:proofErr w:type="gramEnd"/>
-      <w:r>
-        <w:rPr>
-          <w:rStyle w:val="HTMLCode"/>
-          <w:rFonts w:eastAsiaTheme="majorEastAsia"/>
-          <w:lang w:val="es-ES"/>
-        </w:rPr>
-        <w:t>-</w:t>
-      </w:r>
-      <w:proofErr w:type="spellStart"/>
-      <w:r>
-        <w:rPr>
-          <w:rStyle w:val="HTMLCode"/>
-          <w:rFonts w:eastAsiaTheme="majorEastAsia"/>
-          <w:lang w:val="es-ES"/>
-        </w:rPr>
-        <w:t>tabs</w:t>
-      </w:r>
-      <w:proofErr w:type="spellEnd"/>
-      <w:r>
-        <w:rPr>
-          <w:rStyle w:val="HTMLCode"/>
-          <w:rFonts w:eastAsiaTheme="majorEastAsia"/>
-          <w:lang w:val="es-ES"/>
-        </w:rPr>
-        <w:t>-</w:t>
-      </w:r>
-      <w:proofErr w:type="spellStart"/>
-      <w:r>
-        <w:rPr>
-          <w:rStyle w:val="HTMLCode"/>
-          <w:rFonts w:eastAsiaTheme="majorEastAsia"/>
-          <w:lang w:val="es-ES"/>
-        </w:rPr>
-        <w:t>modern</w:t>
-      </w:r>
-      <w:proofErr w:type="spellEnd"/>
-      <w:r>
-        <w:rPr>
-          <w:lang w:val="es-ES"/>
-        </w:rPr>
-        <w:t xml:space="preserve">. Esto mantiene los botones en una sola línea horizontal deslizable, ocultando la barra de </w:t>
-      </w:r>
-      <w:proofErr w:type="spellStart"/>
-      <w:r>
-        <w:rPr>
-          <w:lang w:val="es-ES"/>
-        </w:rPr>
-        <w:t>scroll</w:t>
-      </w:r>
-      <w:proofErr w:type="spellEnd"/>
-      <w:r>
-        <w:rPr>
-          <w:lang w:val="es-ES"/>
-        </w:rPr>
-        <w:t xml:space="preserve"> para dar una experiencia de App nativa.</w:t>
       </w:r>
     </w:p>
     <w:p>
@@ -4585,1617 +5984,15 @@
     <w:p>
       <w:pPr>
         <w:pStyle w:val="Heading3"/>
-        <w:jc w:val="center"/>
-        <w:rPr>
-          <w:b/>
-          <w:bCs/>
-          <w:sz w:val="48"/>
-          <w:szCs w:val="48"/>
-        </w:rPr>
-      </w:pPr>
-      <w:r>
-        <w:rPr>
-          <w:rFonts w:ascii="Segoe UI Emoji" w:hAnsi="Segoe UI Emoji" w:cs="Segoe UI Emoji"/>
-          <w:b/>
-          <w:bCs/>
-          <w:sz w:val="48"/>
-          <w:szCs w:val="48"/>
-        </w:rPr>
-        <w:lastRenderedPageBreak/>
-        <w:t>📱</w:t>
-      </w:r>
-      <w:r>
-        <w:rPr>
-          <w:b/>
-          <w:bCs/>
-          <w:sz w:val="48"/>
-          <w:szCs w:val="48"/>
-        </w:rPr>
-        <w:t xml:space="preserve"> La Solución: CSS </w:t>
-      </w:r>
-      <w:proofErr w:type="spellStart"/>
-      <w:r>
-        <w:rPr>
-          <w:b/>
-          <w:bCs/>
-          <w:sz w:val="48"/>
-          <w:szCs w:val="48"/>
-        </w:rPr>
-        <w:t>Swipe</w:t>
-      </w:r>
-      <w:proofErr w:type="spellEnd"/>
-      <w:r>
-        <w:rPr>
-          <w:b/>
-          <w:bCs/>
-          <w:sz w:val="48"/>
-          <w:szCs w:val="48"/>
-        </w:rPr>
-        <w:t xml:space="preserve"> </w:t>
-      </w:r>
-      <w:proofErr w:type="spellStart"/>
-      <w:r>
-        <w:rPr>
-          <w:b/>
-          <w:bCs/>
-          <w:sz w:val="48"/>
-          <w:szCs w:val="48"/>
-        </w:rPr>
-        <w:t>Menu</w:t>
-      </w:r>
-      <w:proofErr w:type="spellEnd"/>
-      <w:r>
-        <w:rPr>
-          <w:b/>
-          <w:bCs/>
-          <w:sz w:val="48"/>
-          <w:szCs w:val="48"/>
-        </w:rPr>
-        <w:t xml:space="preserve"> (</w:t>
-      </w:r>
-      <w:proofErr w:type="spellStart"/>
-      <w:r>
-        <w:rPr>
-          <w:b/>
-          <w:bCs/>
-          <w:sz w:val="48"/>
-          <w:szCs w:val="48"/>
-        </w:rPr>
-        <w:t>Scroll</w:t>
-      </w:r>
-      <w:proofErr w:type="spellEnd"/>
-      <w:r>
-        <w:rPr>
-          <w:b/>
-          <w:bCs/>
-          <w:sz w:val="48"/>
-          <w:szCs w:val="48"/>
-        </w:rPr>
-        <w:t xml:space="preserve"> Horizontal)</w:t>
-      </w:r>
-    </w:p>
-    <w:p>
-      <w:pPr>
-        <w:pStyle w:val="NormalWeb"/>
-        <w:rPr>
-          <w:lang w:val="es-ES"/>
-        </w:rPr>
-      </w:pPr>
-      <w:r>
-        <w:rPr>
-          <w:lang w:val="es-ES"/>
-        </w:rPr>
-        <w:t>El objetivo es decirle al contenedor de tus botones que, en lugar de aplastarlos o saltar a la siguiente línea, los mantenga en una sola fila y permita deslizar el dedo (o el ratón) hacia los lados, ocultando la fea barra de desplazamiento predeterminada del navegador.</w:t>
-      </w:r>
-    </w:p>
-    <w:p>
-      <w:pPr>
-        <w:pStyle w:val="NormalWeb"/>
-        <w:rPr>
-          <w:lang w:val="es-ES"/>
-        </w:rPr>
-      </w:pPr>
-      <w:r>
-        <w:rPr>
-          <w:b/>
-          <w:bCs/>
-          <w:lang w:val="es-ES"/>
-        </w:rPr>
-        <w:t>Instrucciones para mañana:</w:t>
-      </w:r>
-      <w:r>
-        <w:rPr>
-          <w:lang w:val="es-ES"/>
-        </w:rPr>
-        <w:t xml:space="preserve"> Abre tu archivo de estilos principales: </w:t>
-      </w:r>
-      <w:proofErr w:type="spellStart"/>
-      <w:r>
-        <w:rPr>
-          <w:rStyle w:val="HTMLCode"/>
-          <w:rFonts w:eastAsiaTheme="majorEastAsia"/>
-          <w:b/>
-          <w:bCs/>
-          <w:lang w:val="es-ES"/>
-        </w:rPr>
-        <w:t>assets</w:t>
-      </w:r>
-      <w:proofErr w:type="spellEnd"/>
-      <w:r>
-        <w:rPr>
-          <w:rStyle w:val="HTMLCode"/>
-          <w:rFonts w:eastAsiaTheme="majorEastAsia"/>
-          <w:b/>
-          <w:bCs/>
-          <w:lang w:val="es-ES"/>
-        </w:rPr>
-        <w:t>/</w:t>
-      </w:r>
-      <w:proofErr w:type="spellStart"/>
-      <w:r>
-        <w:rPr>
-          <w:rStyle w:val="HTMLCode"/>
-          <w:rFonts w:eastAsiaTheme="majorEastAsia"/>
-          <w:b/>
-          <w:bCs/>
-          <w:lang w:val="es-ES"/>
-        </w:rPr>
-        <w:t>css</w:t>
-      </w:r>
-      <w:proofErr w:type="spellEnd"/>
-      <w:r>
-        <w:rPr>
-          <w:rStyle w:val="HTMLCode"/>
-          <w:rFonts w:eastAsiaTheme="majorEastAsia"/>
-          <w:b/>
-          <w:bCs/>
-          <w:lang w:val="es-ES"/>
-        </w:rPr>
-        <w:t>/suite-styles.css</w:t>
-      </w:r>
-      <w:r>
-        <w:rPr>
-          <w:lang w:val="es-ES"/>
-        </w:rPr>
-        <w:t xml:space="preserve">. Busca la </w:t>
-      </w:r>
-      <w:proofErr w:type="gramStart"/>
-      <w:r>
-        <w:rPr>
-          <w:lang w:val="es-ES"/>
-        </w:rPr>
-        <w:t xml:space="preserve">clase </w:t>
-      </w:r>
-      <w:r>
-        <w:rPr>
-          <w:rStyle w:val="HTMLCode"/>
-          <w:rFonts w:eastAsiaTheme="majorEastAsia"/>
-          <w:lang w:val="es-ES"/>
-        </w:rPr>
-        <w:t>.suite</w:t>
-      </w:r>
-      <w:proofErr w:type="gramEnd"/>
-      <w:r>
-        <w:rPr>
-          <w:rStyle w:val="HTMLCode"/>
-          <w:rFonts w:eastAsiaTheme="majorEastAsia"/>
-          <w:lang w:val="es-ES"/>
-        </w:rPr>
-        <w:t>-</w:t>
-      </w:r>
-      <w:proofErr w:type="spellStart"/>
-      <w:r>
-        <w:rPr>
-          <w:rStyle w:val="HTMLCode"/>
-          <w:rFonts w:eastAsiaTheme="majorEastAsia"/>
-          <w:lang w:val="es-ES"/>
-        </w:rPr>
-        <w:t>tabs</w:t>
-      </w:r>
-      <w:proofErr w:type="spellEnd"/>
-      <w:r>
-        <w:rPr>
-          <w:rStyle w:val="HTMLCode"/>
-          <w:rFonts w:eastAsiaTheme="majorEastAsia"/>
-          <w:lang w:val="es-ES"/>
-        </w:rPr>
-        <w:t>-</w:t>
-      </w:r>
-      <w:proofErr w:type="spellStart"/>
-      <w:r>
-        <w:rPr>
-          <w:rStyle w:val="HTMLCode"/>
-          <w:rFonts w:eastAsiaTheme="majorEastAsia"/>
-          <w:lang w:val="es-ES"/>
-        </w:rPr>
-        <w:t>modern</w:t>
-      </w:r>
-      <w:proofErr w:type="spellEnd"/>
-      <w:r>
-        <w:rPr>
-          <w:lang w:val="es-ES"/>
-        </w:rPr>
-        <w:t xml:space="preserve"> (que es el contenedor de tus botones) y actualízala para que contenga estas propiedades.</w:t>
-      </w:r>
-    </w:p>
-    <w:p>
-      <w:pPr>
-        <w:pStyle w:val="NormalWeb"/>
-        <w:rPr>
-          <w:lang w:val="es-ES"/>
-        </w:rPr>
-      </w:pPr>
-      <w:r>
-        <w:rPr>
-          <w:lang w:val="es-ES"/>
-        </w:rPr>
-        <w:t>Puedes copiar y pegar este bloque exacto reemplazando el actual:</w:t>
-      </w:r>
-    </w:p>
-    <w:p>
-      <w:r>
-        <w:rPr>
-          <w:rStyle w:val="ng-tns-c416257785-162"/>
-        </w:rPr>
-        <w:t>CSS</w:t>
-      </w:r>
-    </w:p>
-    <w:p>
-      <w:pPr>
-        <w:pStyle w:val="HTMLPreformatted"/>
-        <w:rPr>
-          <w:rStyle w:val="HTMLCode"/>
-          <w:rFonts w:eastAsiaTheme="majorEastAsia"/>
-          <w:lang w:val="es-ES"/>
-        </w:rPr>
-      </w:pPr>
-      <w:r>
-        <w:rPr>
-          <w:rStyle w:val="hljs-comment"/>
-          <w:rFonts w:eastAsiaTheme="majorEastAsia"/>
-          <w:lang w:val="es-ES"/>
-        </w:rPr>
-        <w:t>/* 1. Contenedor Principal del Menú de Pestañas */</w:t>
-      </w:r>
-    </w:p>
-    <w:p>
-      <w:pPr>
-        <w:pStyle w:val="HTMLPreformatted"/>
-        <w:rPr>
-          <w:rStyle w:val="HTMLCode"/>
-          <w:rFonts w:eastAsiaTheme="majorEastAsia"/>
-        </w:rPr>
-      </w:pPr>
-      <w:proofErr w:type="gramStart"/>
-      <w:r>
-        <w:rPr>
-          <w:rStyle w:val="hljs-selector-class"/>
-        </w:rPr>
-        <w:t>.suite</w:t>
-      </w:r>
-      <w:proofErr w:type="gramEnd"/>
-      <w:r>
-        <w:rPr>
-          <w:rStyle w:val="hljs-selector-class"/>
-        </w:rPr>
-        <w:t>-tabs-modern</w:t>
-      </w:r>
-      <w:r>
-        <w:rPr>
-          <w:rStyle w:val="HTMLCode"/>
-          <w:rFonts w:eastAsiaTheme="majorEastAsia"/>
-        </w:rPr>
-        <w:t xml:space="preserve"> {</w:t>
-      </w:r>
-    </w:p>
-    <w:p>
-      <w:pPr>
-        <w:pStyle w:val="HTMLPreformatted"/>
-        <w:rPr>
-          <w:rStyle w:val="HTMLCode"/>
-          <w:rFonts w:eastAsiaTheme="majorEastAsia"/>
-        </w:rPr>
-      </w:pPr>
-      <w:r>
-        <w:rPr>
-          <w:rStyle w:val="HTMLCode"/>
-          <w:rFonts w:eastAsiaTheme="majorEastAsia"/>
-        </w:rPr>
-        <w:t xml:space="preserve">    </w:t>
-      </w:r>
-      <w:r>
-        <w:rPr>
-          <w:rStyle w:val="hljs-attribute"/>
-          <w:rFonts w:eastAsiaTheme="majorEastAsia"/>
-        </w:rPr>
-        <w:t>display</w:t>
-      </w:r>
-      <w:r>
-        <w:rPr>
-          <w:rStyle w:val="HTMLCode"/>
-          <w:rFonts w:eastAsiaTheme="majorEastAsia"/>
-        </w:rPr>
-        <w:t>: flex;</w:t>
-      </w:r>
-    </w:p>
-    <w:p>
-      <w:pPr>
-        <w:pStyle w:val="HTMLPreformatted"/>
-        <w:rPr>
-          <w:rStyle w:val="HTMLCode"/>
-          <w:rFonts w:eastAsiaTheme="majorEastAsia"/>
-          <w:lang w:val="es-ES"/>
-        </w:rPr>
-      </w:pPr>
-      <w:r>
-        <w:rPr>
-          <w:rStyle w:val="HTMLCode"/>
-          <w:rFonts w:eastAsiaTheme="majorEastAsia"/>
-        </w:rPr>
-        <w:t xml:space="preserve">    </w:t>
-      </w:r>
-      <w:proofErr w:type="spellStart"/>
-      <w:r>
-        <w:rPr>
-          <w:rStyle w:val="hljs-attribute"/>
-          <w:rFonts w:eastAsiaTheme="majorEastAsia"/>
-          <w:lang w:val="es-ES"/>
-        </w:rPr>
-        <w:t>flex-wrap</w:t>
-      </w:r>
-      <w:proofErr w:type="spellEnd"/>
-      <w:r>
-        <w:rPr>
-          <w:rStyle w:val="HTMLCode"/>
-          <w:rFonts w:eastAsiaTheme="majorEastAsia"/>
-          <w:lang w:val="es-ES"/>
-        </w:rPr>
-        <w:t xml:space="preserve">: </w:t>
-      </w:r>
-      <w:proofErr w:type="spellStart"/>
-      <w:proofErr w:type="gramStart"/>
-      <w:r>
-        <w:rPr>
-          <w:rStyle w:val="HTMLCode"/>
-          <w:rFonts w:eastAsiaTheme="majorEastAsia"/>
-          <w:lang w:val="es-ES"/>
-        </w:rPr>
-        <w:t>nowrap</w:t>
-      </w:r>
-      <w:proofErr w:type="spellEnd"/>
-      <w:r>
-        <w:rPr>
-          <w:rStyle w:val="HTMLCode"/>
-          <w:rFonts w:eastAsiaTheme="majorEastAsia"/>
-          <w:lang w:val="es-ES"/>
-        </w:rPr>
-        <w:t xml:space="preserve">;   </w:t>
-      </w:r>
-      <w:proofErr w:type="gramEnd"/>
-      <w:r>
-        <w:rPr>
-          <w:rStyle w:val="HTMLCode"/>
-          <w:rFonts w:eastAsiaTheme="majorEastAsia"/>
-          <w:lang w:val="es-ES"/>
-        </w:rPr>
-        <w:t xml:space="preserve">      </w:t>
-      </w:r>
-      <w:r>
-        <w:rPr>
-          <w:rStyle w:val="hljs-comment"/>
-          <w:rFonts w:eastAsiaTheme="majorEastAsia"/>
-          <w:lang w:val="es-ES"/>
-        </w:rPr>
-        <w:t>/* Obliga a los botones a mantenerse en una sola línea horizontal */</w:t>
-      </w:r>
-    </w:p>
-    <w:p>
-      <w:pPr>
-        <w:pStyle w:val="HTMLPreformatted"/>
-        <w:rPr>
-          <w:rStyle w:val="HTMLCode"/>
-          <w:rFonts w:eastAsiaTheme="majorEastAsia"/>
-          <w:lang w:val="es-ES"/>
-        </w:rPr>
-      </w:pPr>
-      <w:r>
-        <w:rPr>
-          <w:rStyle w:val="HTMLCode"/>
-          <w:rFonts w:eastAsiaTheme="majorEastAsia"/>
-          <w:lang w:val="es-ES"/>
-        </w:rPr>
-        <w:t xml:space="preserve">    </w:t>
-      </w:r>
-      <w:proofErr w:type="spellStart"/>
-      <w:r>
-        <w:rPr>
-          <w:rStyle w:val="hljs-attribute"/>
-          <w:rFonts w:eastAsiaTheme="majorEastAsia"/>
-          <w:lang w:val="es-ES"/>
-        </w:rPr>
-        <w:t>overflow</w:t>
-      </w:r>
-      <w:proofErr w:type="spellEnd"/>
-      <w:r>
-        <w:rPr>
-          <w:rStyle w:val="hljs-attribute"/>
-          <w:rFonts w:eastAsiaTheme="majorEastAsia"/>
-          <w:lang w:val="es-ES"/>
-        </w:rPr>
-        <w:t>-x</w:t>
-      </w:r>
-      <w:r>
-        <w:rPr>
-          <w:rStyle w:val="HTMLCode"/>
-          <w:rFonts w:eastAsiaTheme="majorEastAsia"/>
-          <w:lang w:val="es-ES"/>
-        </w:rPr>
-        <w:t xml:space="preserve">: </w:t>
-      </w:r>
-      <w:proofErr w:type="gramStart"/>
-      <w:r>
-        <w:rPr>
-          <w:rStyle w:val="HTMLCode"/>
-          <w:rFonts w:eastAsiaTheme="majorEastAsia"/>
-          <w:lang w:val="es-ES"/>
-        </w:rPr>
-        <w:t xml:space="preserve">auto;   </w:t>
-      </w:r>
-      <w:proofErr w:type="gramEnd"/>
-      <w:r>
-        <w:rPr>
-          <w:rStyle w:val="HTMLCode"/>
-          <w:rFonts w:eastAsiaTheme="majorEastAsia"/>
-          <w:lang w:val="es-ES"/>
-        </w:rPr>
-        <w:t xml:space="preserve">       </w:t>
-      </w:r>
-      <w:r>
-        <w:rPr>
-          <w:rStyle w:val="hljs-comment"/>
-          <w:rFonts w:eastAsiaTheme="majorEastAsia"/>
-          <w:lang w:val="es-ES"/>
-        </w:rPr>
-        <w:t xml:space="preserve">/* Activa el </w:t>
-      </w:r>
-      <w:proofErr w:type="spellStart"/>
-      <w:r>
-        <w:rPr>
-          <w:rStyle w:val="hljs-comment"/>
-          <w:rFonts w:eastAsiaTheme="majorEastAsia"/>
-          <w:lang w:val="es-ES"/>
-        </w:rPr>
-        <w:t>scroll</w:t>
-      </w:r>
-      <w:proofErr w:type="spellEnd"/>
-      <w:r>
-        <w:rPr>
-          <w:rStyle w:val="hljs-comment"/>
-          <w:rFonts w:eastAsiaTheme="majorEastAsia"/>
-          <w:lang w:val="es-ES"/>
-        </w:rPr>
-        <w:t xml:space="preserve"> horizontal si los botones superan el ancho de la pantalla */</w:t>
-      </w:r>
-    </w:p>
-    <w:p>
-      <w:pPr>
-        <w:pStyle w:val="HTMLPreformatted"/>
-        <w:rPr>
-          <w:rStyle w:val="HTMLCode"/>
-          <w:rFonts w:eastAsiaTheme="majorEastAsia"/>
-          <w:lang w:val="es-ES"/>
-        </w:rPr>
-      </w:pPr>
-      <w:r>
-        <w:rPr>
-          <w:rStyle w:val="HTMLCode"/>
-          <w:rFonts w:eastAsiaTheme="majorEastAsia"/>
-          <w:lang w:val="es-ES"/>
-        </w:rPr>
-        <w:t xml:space="preserve">    -webkit-</w:t>
-      </w:r>
-      <w:proofErr w:type="spellStart"/>
-      <w:r>
-        <w:rPr>
-          <w:rStyle w:val="hljs-attribute"/>
-          <w:rFonts w:eastAsiaTheme="majorEastAsia"/>
-          <w:lang w:val="es-ES"/>
-        </w:rPr>
-        <w:t>overflow</w:t>
-      </w:r>
-      <w:proofErr w:type="spellEnd"/>
-      <w:r>
-        <w:rPr>
-          <w:rStyle w:val="HTMLCode"/>
-          <w:rFonts w:eastAsiaTheme="majorEastAsia"/>
-          <w:lang w:val="es-ES"/>
-        </w:rPr>
-        <w:t>-</w:t>
-      </w:r>
-      <w:proofErr w:type="spellStart"/>
-      <w:r>
-        <w:rPr>
-          <w:rStyle w:val="HTMLCode"/>
-          <w:rFonts w:eastAsiaTheme="majorEastAsia"/>
-          <w:lang w:val="es-ES"/>
-        </w:rPr>
-        <w:t>scrolling</w:t>
-      </w:r>
-      <w:proofErr w:type="spellEnd"/>
-      <w:r>
-        <w:rPr>
-          <w:rStyle w:val="HTMLCode"/>
-          <w:rFonts w:eastAsiaTheme="majorEastAsia"/>
-          <w:lang w:val="es-ES"/>
-        </w:rPr>
-        <w:t xml:space="preserve">: </w:t>
-      </w:r>
-      <w:proofErr w:type="spellStart"/>
-      <w:r>
-        <w:rPr>
-          <w:rStyle w:val="HTMLCode"/>
-          <w:rFonts w:eastAsiaTheme="majorEastAsia"/>
-          <w:lang w:val="es-ES"/>
-        </w:rPr>
-        <w:t>touch</w:t>
-      </w:r>
-      <w:proofErr w:type="spellEnd"/>
-      <w:r>
-        <w:rPr>
-          <w:rStyle w:val="HTMLCode"/>
-          <w:rFonts w:eastAsiaTheme="majorEastAsia"/>
-          <w:lang w:val="es-ES"/>
-        </w:rPr>
-        <w:t xml:space="preserve">; </w:t>
-      </w:r>
-      <w:r>
-        <w:rPr>
-          <w:rStyle w:val="hljs-comment"/>
-          <w:rFonts w:eastAsiaTheme="majorEastAsia"/>
-          <w:lang w:val="es-ES"/>
-        </w:rPr>
-        <w:t xml:space="preserve">/* Activa el </w:t>
-      </w:r>
-      <w:proofErr w:type="spellStart"/>
-      <w:r>
-        <w:rPr>
-          <w:rStyle w:val="hljs-comment"/>
-          <w:rFonts w:eastAsiaTheme="majorEastAsia"/>
-          <w:lang w:val="es-ES"/>
-        </w:rPr>
-        <w:t>scroll</w:t>
-      </w:r>
-      <w:proofErr w:type="spellEnd"/>
-      <w:r>
-        <w:rPr>
-          <w:rStyle w:val="hljs-comment"/>
-          <w:rFonts w:eastAsiaTheme="majorEastAsia"/>
-          <w:lang w:val="es-ES"/>
-        </w:rPr>
-        <w:t xml:space="preserve"> suave (fricción nativa) en iOS/</w:t>
-      </w:r>
-      <w:proofErr w:type="spellStart"/>
-      <w:r>
-        <w:rPr>
-          <w:rStyle w:val="hljs-comment"/>
-          <w:rFonts w:eastAsiaTheme="majorEastAsia"/>
-          <w:lang w:val="es-ES"/>
-        </w:rPr>
-        <w:t>iPhones</w:t>
-      </w:r>
-      <w:proofErr w:type="spellEnd"/>
-      <w:r>
-        <w:rPr>
-          <w:rStyle w:val="hljs-comment"/>
-          <w:rFonts w:eastAsiaTheme="majorEastAsia"/>
-          <w:lang w:val="es-ES"/>
-        </w:rPr>
-        <w:t xml:space="preserve"> */</w:t>
-      </w:r>
-    </w:p>
-    <w:p>
-      <w:pPr>
-        <w:pStyle w:val="HTMLPreformatted"/>
-        <w:rPr>
-          <w:rStyle w:val="HTMLCode"/>
-          <w:rFonts w:eastAsiaTheme="majorEastAsia"/>
-          <w:lang w:val="es-ES"/>
-        </w:rPr>
-      </w:pPr>
-      <w:r>
-        <w:rPr>
-          <w:rStyle w:val="HTMLCode"/>
-          <w:rFonts w:eastAsiaTheme="majorEastAsia"/>
-          <w:lang w:val="es-ES"/>
-        </w:rPr>
-        <w:t xml:space="preserve">    gap: </w:t>
-      </w:r>
-      <w:r>
-        <w:rPr>
-          <w:rStyle w:val="hljs-number"/>
-          <w:lang w:val="es-ES"/>
-        </w:rPr>
-        <w:t>10</w:t>
-      </w:r>
-      <w:proofErr w:type="gramStart"/>
-      <w:r>
-        <w:rPr>
-          <w:rStyle w:val="hljs-number"/>
-          <w:lang w:val="es-ES"/>
-        </w:rPr>
-        <w:t>px</w:t>
-      </w:r>
-      <w:r>
-        <w:rPr>
-          <w:rStyle w:val="HTMLCode"/>
-          <w:rFonts w:eastAsiaTheme="majorEastAsia"/>
-          <w:lang w:val="es-ES"/>
-        </w:rPr>
-        <w:t xml:space="preserve">;   </w:t>
-      </w:r>
-      <w:proofErr w:type="gramEnd"/>
-      <w:r>
-        <w:rPr>
-          <w:rStyle w:val="HTMLCode"/>
-          <w:rFonts w:eastAsiaTheme="majorEastAsia"/>
-          <w:lang w:val="es-ES"/>
-        </w:rPr>
-        <w:t xml:space="preserve">              </w:t>
-      </w:r>
-      <w:r>
-        <w:rPr>
-          <w:rStyle w:val="hljs-comment"/>
-          <w:rFonts w:eastAsiaTheme="majorEastAsia"/>
-          <w:lang w:val="es-ES"/>
-        </w:rPr>
-        <w:t>/* Espaciado uniforme entre las pestañas */</w:t>
-      </w:r>
-    </w:p>
-    <w:p>
-      <w:pPr>
-        <w:pStyle w:val="HTMLPreformatted"/>
-        <w:rPr>
-          <w:rStyle w:val="HTMLCode"/>
-          <w:rFonts w:eastAsiaTheme="majorEastAsia"/>
-          <w:lang w:val="es-ES"/>
-        </w:rPr>
-      </w:pPr>
-      <w:r>
-        <w:rPr>
-          <w:rStyle w:val="HTMLCode"/>
-          <w:rFonts w:eastAsiaTheme="majorEastAsia"/>
-          <w:lang w:val="es-ES"/>
-        </w:rPr>
-        <w:t xml:space="preserve">    </w:t>
-      </w:r>
-      <w:proofErr w:type="spellStart"/>
-      <w:r>
-        <w:rPr>
-          <w:rStyle w:val="hljs-attribute"/>
-          <w:rFonts w:eastAsiaTheme="majorEastAsia"/>
-          <w:lang w:val="es-ES"/>
-        </w:rPr>
-        <w:t>padding</w:t>
-      </w:r>
-      <w:proofErr w:type="spellEnd"/>
-      <w:r>
-        <w:rPr>
-          <w:rStyle w:val="hljs-attribute"/>
-          <w:rFonts w:eastAsiaTheme="majorEastAsia"/>
-          <w:lang w:val="es-ES"/>
-        </w:rPr>
-        <w:t>-bottom</w:t>
-      </w:r>
-      <w:r>
-        <w:rPr>
-          <w:rStyle w:val="HTMLCode"/>
-          <w:rFonts w:eastAsiaTheme="majorEastAsia"/>
-          <w:lang w:val="es-ES"/>
-        </w:rPr>
-        <w:t xml:space="preserve">: </w:t>
-      </w:r>
-      <w:r>
-        <w:rPr>
-          <w:rStyle w:val="hljs-number"/>
-          <w:lang w:val="es-ES"/>
-        </w:rPr>
-        <w:t>5</w:t>
-      </w:r>
-      <w:proofErr w:type="gramStart"/>
-      <w:r>
-        <w:rPr>
-          <w:rStyle w:val="hljs-number"/>
-          <w:lang w:val="es-ES"/>
-        </w:rPr>
-        <w:t>px</w:t>
-      </w:r>
-      <w:r>
-        <w:rPr>
-          <w:rStyle w:val="HTMLCode"/>
-          <w:rFonts w:eastAsiaTheme="majorEastAsia"/>
-          <w:lang w:val="es-ES"/>
-        </w:rPr>
-        <w:t xml:space="preserve">;   </w:t>
-      </w:r>
-      <w:proofErr w:type="gramEnd"/>
-      <w:r>
-        <w:rPr>
-          <w:rStyle w:val="HTMLCode"/>
-          <w:rFonts w:eastAsiaTheme="majorEastAsia"/>
-          <w:lang w:val="es-ES"/>
-        </w:rPr>
-        <w:t xml:space="preserve">    </w:t>
-      </w:r>
-      <w:r>
-        <w:rPr>
-          <w:rStyle w:val="hljs-comment"/>
-          <w:rFonts w:eastAsiaTheme="majorEastAsia"/>
-          <w:lang w:val="es-ES"/>
-        </w:rPr>
-        <w:t>/* Pequeño margen para que la sombra de los botones respire */</w:t>
-      </w:r>
-    </w:p>
-    <w:p>
-      <w:pPr>
-        <w:pStyle w:val="HTMLPreformatted"/>
-        <w:rPr>
-          <w:rStyle w:val="HTMLCode"/>
-          <w:rFonts w:eastAsiaTheme="majorEastAsia"/>
-          <w:lang w:val="es-ES"/>
-        </w:rPr>
-      </w:pPr>
-      <w:r>
-        <w:rPr>
-          <w:rStyle w:val="HTMLCode"/>
-          <w:rFonts w:eastAsiaTheme="majorEastAsia"/>
-          <w:lang w:val="es-ES"/>
-        </w:rPr>
-        <w:t xml:space="preserve">    </w:t>
-      </w:r>
-    </w:p>
-    <w:p>
-      <w:pPr>
-        <w:pStyle w:val="HTMLPreformatted"/>
-        <w:rPr>
-          <w:rStyle w:val="HTMLCode"/>
-          <w:rFonts w:eastAsiaTheme="majorEastAsia"/>
-          <w:lang w:val="es-ES"/>
-        </w:rPr>
-      </w:pPr>
-      <w:r>
-        <w:rPr>
-          <w:rStyle w:val="HTMLCode"/>
-          <w:rFonts w:eastAsiaTheme="majorEastAsia"/>
-          <w:lang w:val="es-ES"/>
-        </w:rPr>
-        <w:t xml:space="preserve">    </w:t>
-      </w:r>
-      <w:r>
-        <w:rPr>
-          <w:rStyle w:val="hljs-comment"/>
-          <w:rFonts w:eastAsiaTheme="majorEastAsia"/>
-          <w:lang w:val="es-ES"/>
-        </w:rPr>
-        <w:t xml:space="preserve">/* Ocultar barra de </w:t>
-      </w:r>
-      <w:proofErr w:type="spellStart"/>
-      <w:r>
-        <w:rPr>
-          <w:rStyle w:val="hljs-comment"/>
-          <w:rFonts w:eastAsiaTheme="majorEastAsia"/>
-          <w:lang w:val="es-ES"/>
-        </w:rPr>
-        <w:t>scroll</w:t>
-      </w:r>
-      <w:proofErr w:type="spellEnd"/>
-      <w:r>
-        <w:rPr>
-          <w:rStyle w:val="hljs-comment"/>
-          <w:rFonts w:eastAsiaTheme="majorEastAsia"/>
-          <w:lang w:val="es-ES"/>
-        </w:rPr>
-        <w:t xml:space="preserve"> en Firefox */</w:t>
-      </w:r>
-    </w:p>
-    <w:p>
-      <w:pPr>
-        <w:pStyle w:val="HTMLPreformatted"/>
-        <w:rPr>
-          <w:rStyle w:val="HTMLCode"/>
-          <w:rFonts w:eastAsiaTheme="majorEastAsia"/>
-        </w:rPr>
-      </w:pPr>
-      <w:r>
-        <w:rPr>
-          <w:rStyle w:val="HTMLCode"/>
-          <w:rFonts w:eastAsiaTheme="majorEastAsia"/>
-          <w:lang w:val="es-ES"/>
-        </w:rPr>
-        <w:t xml:space="preserve">    </w:t>
-      </w:r>
-      <w:r>
-        <w:rPr>
-          <w:rStyle w:val="HTMLCode"/>
-          <w:rFonts w:eastAsiaTheme="majorEastAsia"/>
-        </w:rPr>
-        <w:t>scrollbar-</w:t>
-      </w:r>
-      <w:r>
-        <w:rPr>
-          <w:rStyle w:val="hljs-attribute"/>
-          <w:rFonts w:eastAsiaTheme="majorEastAsia"/>
-        </w:rPr>
-        <w:t>width</w:t>
-      </w:r>
-      <w:r>
-        <w:rPr>
-          <w:rStyle w:val="HTMLCode"/>
-          <w:rFonts w:eastAsiaTheme="majorEastAsia"/>
-        </w:rPr>
-        <w:t xml:space="preserve">: none;     </w:t>
-      </w:r>
-    </w:p>
-    <w:p>
-      <w:pPr>
-        <w:pStyle w:val="HTMLPreformatted"/>
-        <w:rPr>
-          <w:rStyle w:val="HTMLCode"/>
-          <w:rFonts w:eastAsiaTheme="majorEastAsia"/>
-        </w:rPr>
-      </w:pPr>
-      <w:r>
-        <w:rPr>
-          <w:rStyle w:val="HTMLCode"/>
-          <w:rFonts w:eastAsiaTheme="majorEastAsia"/>
-        </w:rPr>
-        <w:t xml:space="preserve">    </w:t>
-      </w:r>
-      <w:r>
-        <w:rPr>
-          <w:rStyle w:val="hljs-comment"/>
-          <w:rFonts w:eastAsiaTheme="majorEastAsia"/>
-        </w:rPr>
-        <w:t xml:space="preserve">/* </w:t>
-      </w:r>
-      <w:proofErr w:type="spellStart"/>
-      <w:r>
-        <w:rPr>
-          <w:rStyle w:val="hljs-comment"/>
-          <w:rFonts w:eastAsiaTheme="majorEastAsia"/>
-        </w:rPr>
-        <w:t>Ocultar</w:t>
-      </w:r>
-      <w:proofErr w:type="spellEnd"/>
-      <w:r>
-        <w:rPr>
-          <w:rStyle w:val="hljs-comment"/>
-          <w:rFonts w:eastAsiaTheme="majorEastAsia"/>
-        </w:rPr>
-        <w:t xml:space="preserve"> </w:t>
-      </w:r>
-      <w:proofErr w:type="spellStart"/>
-      <w:r>
-        <w:rPr>
-          <w:rStyle w:val="hljs-comment"/>
-          <w:rFonts w:eastAsiaTheme="majorEastAsia"/>
-        </w:rPr>
-        <w:t>barra</w:t>
-      </w:r>
-      <w:proofErr w:type="spellEnd"/>
-      <w:r>
-        <w:rPr>
-          <w:rStyle w:val="hljs-comment"/>
-          <w:rFonts w:eastAsiaTheme="majorEastAsia"/>
-        </w:rPr>
-        <w:t xml:space="preserve"> de scroll </w:t>
-      </w:r>
-      <w:proofErr w:type="spellStart"/>
-      <w:r>
-        <w:rPr>
-          <w:rStyle w:val="hljs-comment"/>
-          <w:rFonts w:eastAsiaTheme="majorEastAsia"/>
-        </w:rPr>
-        <w:t>en</w:t>
-      </w:r>
-      <w:proofErr w:type="spellEnd"/>
-      <w:r>
-        <w:rPr>
-          <w:rStyle w:val="hljs-comment"/>
-          <w:rFonts w:eastAsiaTheme="majorEastAsia"/>
-        </w:rPr>
-        <w:t xml:space="preserve"> IE/Edge </w:t>
-      </w:r>
-      <w:proofErr w:type="spellStart"/>
-      <w:r>
-        <w:rPr>
-          <w:rStyle w:val="hljs-comment"/>
-          <w:rFonts w:eastAsiaTheme="majorEastAsia"/>
-        </w:rPr>
-        <w:t>antiguo</w:t>
-      </w:r>
-      <w:proofErr w:type="spellEnd"/>
-      <w:r>
-        <w:rPr>
-          <w:rStyle w:val="hljs-comment"/>
-          <w:rFonts w:eastAsiaTheme="majorEastAsia"/>
-        </w:rPr>
-        <w:t xml:space="preserve"> */</w:t>
-      </w:r>
-    </w:p>
-    <w:p>
-      <w:pPr>
-        <w:pStyle w:val="HTMLPreformatted"/>
-        <w:rPr>
-          <w:rStyle w:val="HTMLCode"/>
-          <w:rFonts w:eastAsiaTheme="majorEastAsia"/>
-        </w:rPr>
-      </w:pPr>
-      <w:r>
-        <w:rPr>
-          <w:rStyle w:val="HTMLCode"/>
-          <w:rFonts w:eastAsiaTheme="majorEastAsia"/>
-        </w:rPr>
-        <w:t xml:space="preserve">    -</w:t>
-      </w:r>
-      <w:proofErr w:type="spellStart"/>
-      <w:r>
-        <w:rPr>
-          <w:rStyle w:val="HTMLCode"/>
-          <w:rFonts w:eastAsiaTheme="majorEastAsia"/>
-        </w:rPr>
-        <w:t>ms</w:t>
-      </w:r>
-      <w:proofErr w:type="spellEnd"/>
-      <w:r>
-        <w:rPr>
-          <w:rStyle w:val="HTMLCode"/>
-          <w:rFonts w:eastAsiaTheme="majorEastAsia"/>
-        </w:rPr>
-        <w:t>-</w:t>
-      </w:r>
-      <w:r>
-        <w:rPr>
-          <w:rStyle w:val="hljs-attribute"/>
-          <w:rFonts w:eastAsiaTheme="majorEastAsia"/>
-        </w:rPr>
-        <w:t>overflow</w:t>
-      </w:r>
-      <w:r>
-        <w:rPr>
-          <w:rStyle w:val="HTMLCode"/>
-          <w:rFonts w:eastAsiaTheme="majorEastAsia"/>
-        </w:rPr>
-        <w:t xml:space="preserve">-style: none;  </w:t>
-      </w:r>
-    </w:p>
-    <w:p>
-      <w:pPr>
-        <w:pStyle w:val="HTMLPreformatted"/>
-        <w:rPr>
-          <w:rStyle w:val="HTMLCode"/>
-          <w:rFonts w:eastAsiaTheme="majorEastAsia"/>
-          <w:lang w:val="es-ES"/>
-        </w:rPr>
-      </w:pPr>
-      <w:r>
-        <w:rPr>
-          <w:rStyle w:val="HTMLCode"/>
-          <w:rFonts w:eastAsiaTheme="majorEastAsia"/>
-          <w:lang w:val="es-ES"/>
-        </w:rPr>
-        <w:t>}</w:t>
-      </w:r>
-    </w:p>
-    <w:p>
-      <w:pPr>
-        <w:pStyle w:val="HTMLPreformatted"/>
-        <w:rPr>
-          <w:rStyle w:val="HTMLCode"/>
-          <w:rFonts w:eastAsiaTheme="majorEastAsia"/>
-          <w:lang w:val="es-ES"/>
-        </w:rPr>
-      </w:pPr>
-    </w:p>
-    <w:p>
-      <w:pPr>
-        <w:pStyle w:val="HTMLPreformatted"/>
-        <w:rPr>
-          <w:rStyle w:val="HTMLCode"/>
-          <w:rFonts w:eastAsiaTheme="majorEastAsia"/>
-          <w:lang w:val="es-ES"/>
-        </w:rPr>
-      </w:pPr>
-      <w:r>
-        <w:rPr>
-          <w:rStyle w:val="hljs-comment"/>
-          <w:rFonts w:eastAsiaTheme="majorEastAsia"/>
-          <w:lang w:val="es-ES"/>
-        </w:rPr>
-        <w:t xml:space="preserve">/* 2. Ocultar la barra de </w:t>
-      </w:r>
-      <w:proofErr w:type="spellStart"/>
-      <w:r>
-        <w:rPr>
-          <w:rStyle w:val="hljs-comment"/>
-          <w:rFonts w:eastAsiaTheme="majorEastAsia"/>
-          <w:lang w:val="es-ES"/>
-        </w:rPr>
-        <w:t>scroll</w:t>
-      </w:r>
-      <w:proofErr w:type="spellEnd"/>
-      <w:r>
-        <w:rPr>
-          <w:rStyle w:val="hljs-comment"/>
-          <w:rFonts w:eastAsiaTheme="majorEastAsia"/>
-          <w:lang w:val="es-ES"/>
-        </w:rPr>
-        <w:t xml:space="preserve"> en Chrome, Safari y Edge (Magia visual) */</w:t>
-      </w:r>
-    </w:p>
-    <w:p>
-      <w:pPr>
-        <w:pStyle w:val="HTMLPreformatted"/>
-        <w:rPr>
-          <w:rStyle w:val="HTMLCode"/>
-          <w:rFonts w:eastAsiaTheme="majorEastAsia"/>
-        </w:rPr>
-      </w:pPr>
-      <w:proofErr w:type="gramStart"/>
-      <w:r>
-        <w:rPr>
-          <w:rStyle w:val="hljs-selector-class"/>
-        </w:rPr>
-        <w:t>.suite</w:t>
-      </w:r>
-      <w:proofErr w:type="gramEnd"/>
-      <w:r>
-        <w:rPr>
-          <w:rStyle w:val="hljs-selector-class"/>
-        </w:rPr>
-        <w:t>-tabs-modern</w:t>
-      </w:r>
-      <w:r>
-        <w:rPr>
-          <w:rStyle w:val="HTMLCode"/>
-          <w:rFonts w:eastAsiaTheme="majorEastAsia"/>
-        </w:rPr>
-        <w:t>::-</w:t>
-      </w:r>
-      <w:proofErr w:type="spellStart"/>
-      <w:r>
-        <w:rPr>
-          <w:rStyle w:val="HTMLCode"/>
-          <w:rFonts w:eastAsiaTheme="majorEastAsia"/>
-        </w:rPr>
-        <w:t>webkit</w:t>
-      </w:r>
-      <w:proofErr w:type="spellEnd"/>
-      <w:r>
-        <w:rPr>
-          <w:rStyle w:val="HTMLCode"/>
-          <w:rFonts w:eastAsiaTheme="majorEastAsia"/>
-        </w:rPr>
-        <w:t>-scrollbar {</w:t>
-      </w:r>
-    </w:p>
-    <w:p>
-      <w:pPr>
-        <w:pStyle w:val="HTMLPreformatted"/>
-        <w:rPr>
-          <w:rStyle w:val="HTMLCode"/>
-          <w:rFonts w:eastAsiaTheme="majorEastAsia"/>
-          <w:lang w:val="es-ES"/>
-        </w:rPr>
-      </w:pPr>
-      <w:r>
-        <w:rPr>
-          <w:rStyle w:val="HTMLCode"/>
-          <w:rFonts w:eastAsiaTheme="majorEastAsia"/>
-        </w:rPr>
-        <w:t xml:space="preserve">    </w:t>
-      </w:r>
-      <w:proofErr w:type="spellStart"/>
-      <w:r>
-        <w:rPr>
-          <w:rStyle w:val="HTMLCode"/>
-          <w:rFonts w:eastAsiaTheme="majorEastAsia"/>
-          <w:lang w:val="es-ES"/>
-        </w:rPr>
-        <w:t>display</w:t>
-      </w:r>
-      <w:proofErr w:type="spellEnd"/>
-      <w:r>
-        <w:rPr>
-          <w:rStyle w:val="HTMLCode"/>
-          <w:rFonts w:eastAsiaTheme="majorEastAsia"/>
-          <w:lang w:val="es-ES"/>
-        </w:rPr>
-        <w:t xml:space="preserve">: </w:t>
-      </w:r>
-      <w:proofErr w:type="spellStart"/>
-      <w:r>
-        <w:rPr>
-          <w:rStyle w:val="HTMLCode"/>
-          <w:rFonts w:eastAsiaTheme="majorEastAsia"/>
-          <w:lang w:val="es-ES"/>
-        </w:rPr>
-        <w:t>none</w:t>
-      </w:r>
-      <w:proofErr w:type="spellEnd"/>
-      <w:r>
-        <w:rPr>
-          <w:rStyle w:val="HTMLCode"/>
-          <w:rFonts w:eastAsiaTheme="majorEastAsia"/>
-          <w:lang w:val="es-ES"/>
-        </w:rPr>
-        <w:t>;</w:t>
-      </w:r>
-    </w:p>
-    <w:p>
-      <w:pPr>
-        <w:pStyle w:val="HTMLPreformatted"/>
-        <w:rPr>
-          <w:rStyle w:val="HTMLCode"/>
-          <w:rFonts w:eastAsiaTheme="majorEastAsia"/>
-          <w:lang w:val="es-ES"/>
-        </w:rPr>
-      </w:pPr>
-      <w:r>
-        <w:rPr>
-          <w:rStyle w:val="HTMLCode"/>
-          <w:rFonts w:eastAsiaTheme="majorEastAsia"/>
-          <w:lang w:val="es-ES"/>
-        </w:rPr>
-        <w:t>}</w:t>
-      </w:r>
-    </w:p>
-    <w:p>
-      <w:pPr>
-        <w:pStyle w:val="HTMLPreformatted"/>
-        <w:rPr>
-          <w:rStyle w:val="HTMLCode"/>
-          <w:rFonts w:eastAsiaTheme="majorEastAsia"/>
-          <w:lang w:val="es-ES"/>
-        </w:rPr>
-      </w:pPr>
-    </w:p>
-    <w:p>
-      <w:pPr>
-        <w:pStyle w:val="HTMLPreformatted"/>
-        <w:rPr>
-          <w:rStyle w:val="HTMLCode"/>
-          <w:rFonts w:eastAsiaTheme="majorEastAsia"/>
-          <w:lang w:val="es-ES"/>
-        </w:rPr>
-      </w:pPr>
-      <w:r>
-        <w:rPr>
-          <w:rStyle w:val="hljs-comment"/>
-          <w:rFonts w:eastAsiaTheme="majorEastAsia"/>
-          <w:lang w:val="es-ES"/>
-        </w:rPr>
-        <w:t>/* 3. Protección para los Botones Internos */</w:t>
-      </w:r>
-    </w:p>
-    <w:p>
-      <w:pPr>
-        <w:pStyle w:val="HTMLPreformatted"/>
-        <w:rPr>
-          <w:rStyle w:val="HTMLCode"/>
-          <w:rFonts w:eastAsiaTheme="majorEastAsia"/>
-        </w:rPr>
-      </w:pPr>
-      <w:proofErr w:type="gramStart"/>
-      <w:r>
-        <w:rPr>
-          <w:rStyle w:val="hljs-selector-class"/>
-        </w:rPr>
-        <w:t>.suite</w:t>
-      </w:r>
-      <w:proofErr w:type="gramEnd"/>
-      <w:r>
-        <w:rPr>
-          <w:rStyle w:val="hljs-selector-class"/>
-        </w:rPr>
-        <w:t>-tabs-modern</w:t>
-      </w:r>
-      <w:r>
-        <w:rPr>
-          <w:rStyle w:val="HTMLCode"/>
-          <w:rFonts w:eastAsiaTheme="majorEastAsia"/>
-        </w:rPr>
-        <w:t xml:space="preserve"> </w:t>
-      </w:r>
-      <w:r>
-        <w:rPr>
-          <w:rStyle w:val="hljs-selector-class"/>
-        </w:rPr>
-        <w:t>.tab-</w:t>
-      </w:r>
-      <w:proofErr w:type="spellStart"/>
-      <w:r>
-        <w:rPr>
-          <w:rStyle w:val="hljs-selector-class"/>
-        </w:rPr>
-        <w:t>btn</w:t>
-      </w:r>
-      <w:proofErr w:type="spellEnd"/>
-      <w:r>
-        <w:rPr>
-          <w:rStyle w:val="HTMLCode"/>
-          <w:rFonts w:eastAsiaTheme="majorEastAsia"/>
-        </w:rPr>
-        <w:t xml:space="preserve"> {</w:t>
-      </w:r>
-    </w:p>
-    <w:p>
-      <w:pPr>
-        <w:pStyle w:val="HTMLPreformatted"/>
-        <w:rPr>
-          <w:rStyle w:val="HTMLCode"/>
-          <w:rFonts w:eastAsiaTheme="majorEastAsia"/>
-          <w:lang w:val="es-ES"/>
-        </w:rPr>
-      </w:pPr>
-      <w:r>
-        <w:rPr>
-          <w:rStyle w:val="HTMLCode"/>
-          <w:rFonts w:eastAsiaTheme="majorEastAsia"/>
-        </w:rPr>
-        <w:t xml:space="preserve">    </w:t>
-      </w:r>
-      <w:proofErr w:type="spellStart"/>
-      <w:r>
-        <w:rPr>
-          <w:rStyle w:val="hljs-attribute"/>
-          <w:rFonts w:eastAsiaTheme="majorEastAsia"/>
-          <w:lang w:val="es-ES"/>
-        </w:rPr>
-        <w:t>flex-shrink</w:t>
-      </w:r>
-      <w:proofErr w:type="spellEnd"/>
-      <w:r>
-        <w:rPr>
-          <w:rStyle w:val="HTMLCode"/>
-          <w:rFonts w:eastAsiaTheme="majorEastAsia"/>
-          <w:lang w:val="es-ES"/>
-        </w:rPr>
-        <w:t xml:space="preserve">: </w:t>
-      </w:r>
-      <w:proofErr w:type="gramStart"/>
-      <w:r>
-        <w:rPr>
-          <w:rStyle w:val="hljs-number"/>
-          <w:lang w:val="es-ES"/>
-        </w:rPr>
-        <w:t>0</w:t>
-      </w:r>
-      <w:r>
-        <w:rPr>
-          <w:rStyle w:val="HTMLCode"/>
-          <w:rFonts w:eastAsiaTheme="majorEastAsia"/>
-          <w:lang w:val="es-ES"/>
-        </w:rPr>
-        <w:t xml:space="preserve">;   </w:t>
-      </w:r>
-      <w:proofErr w:type="gramEnd"/>
-      <w:r>
-        <w:rPr>
-          <w:rStyle w:val="HTMLCode"/>
-          <w:rFonts w:eastAsiaTheme="majorEastAsia"/>
-          <w:lang w:val="es-ES"/>
-        </w:rPr>
-        <w:t xml:space="preserve">         </w:t>
-      </w:r>
-      <w:r>
-        <w:rPr>
-          <w:rStyle w:val="hljs-comment"/>
-          <w:rFonts w:eastAsiaTheme="majorEastAsia"/>
-          <w:lang w:val="es-ES"/>
-        </w:rPr>
-        <w:t>/* Evita que el navegador intente "aplastar" o encoger los botones */</w:t>
-      </w:r>
-    </w:p>
-    <w:p>
-      <w:pPr>
-        <w:pStyle w:val="HTMLPreformatted"/>
-        <w:rPr>
-          <w:rStyle w:val="HTMLCode"/>
-          <w:rFonts w:eastAsiaTheme="majorEastAsia"/>
-          <w:lang w:val="es-ES"/>
-        </w:rPr>
-      </w:pPr>
-      <w:r>
-        <w:rPr>
-          <w:rStyle w:val="HTMLCode"/>
-          <w:rFonts w:eastAsiaTheme="majorEastAsia"/>
-          <w:lang w:val="es-ES"/>
-        </w:rPr>
-        <w:t xml:space="preserve">    </w:t>
-      </w:r>
-      <w:proofErr w:type="spellStart"/>
-      <w:r>
-        <w:rPr>
-          <w:rStyle w:val="hljs-attribute"/>
-          <w:rFonts w:eastAsiaTheme="majorEastAsia"/>
-          <w:lang w:val="es-ES"/>
-        </w:rPr>
-        <w:t>white-space</w:t>
-      </w:r>
-      <w:proofErr w:type="spellEnd"/>
-      <w:r>
-        <w:rPr>
-          <w:rStyle w:val="HTMLCode"/>
-          <w:rFonts w:eastAsiaTheme="majorEastAsia"/>
-          <w:lang w:val="es-ES"/>
-        </w:rPr>
-        <w:t xml:space="preserve">: </w:t>
-      </w:r>
-      <w:proofErr w:type="spellStart"/>
-      <w:proofErr w:type="gramStart"/>
-      <w:r>
-        <w:rPr>
-          <w:rStyle w:val="HTMLCode"/>
-          <w:rFonts w:eastAsiaTheme="majorEastAsia"/>
-          <w:lang w:val="es-ES"/>
-        </w:rPr>
-        <w:t>nowrap</w:t>
-      </w:r>
-      <w:proofErr w:type="spellEnd"/>
-      <w:r>
-        <w:rPr>
-          <w:rStyle w:val="HTMLCode"/>
-          <w:rFonts w:eastAsiaTheme="majorEastAsia"/>
-          <w:lang w:val="es-ES"/>
-        </w:rPr>
-        <w:t xml:space="preserve">;   </w:t>
-      </w:r>
-      <w:proofErr w:type="gramEnd"/>
-      <w:r>
-        <w:rPr>
-          <w:rStyle w:val="HTMLCode"/>
-          <w:rFonts w:eastAsiaTheme="majorEastAsia"/>
-          <w:lang w:val="es-ES"/>
-        </w:rPr>
-        <w:t xml:space="preserve">    </w:t>
-      </w:r>
-      <w:r>
-        <w:rPr>
-          <w:rStyle w:val="hljs-comment"/>
-          <w:rFonts w:eastAsiaTheme="majorEastAsia"/>
-          <w:lang w:val="es-ES"/>
-        </w:rPr>
-        <w:t>/* Mantiene el texto del botón (</w:t>
-      </w:r>
-      <w:proofErr w:type="spellStart"/>
-      <w:r>
-        <w:rPr>
-          <w:rStyle w:val="hljs-comment"/>
-          <w:rFonts w:eastAsiaTheme="majorEastAsia"/>
-          <w:lang w:val="es-ES"/>
-        </w:rPr>
-        <w:t>ej</w:t>
-      </w:r>
-      <w:proofErr w:type="spellEnd"/>
-      <w:r>
-        <w:rPr>
-          <w:rStyle w:val="hljs-comment"/>
-          <w:rFonts w:eastAsiaTheme="majorEastAsia"/>
-          <w:lang w:val="es-ES"/>
-        </w:rPr>
-        <w:t>: "</w:t>
-      </w:r>
-      <w:r>
-        <w:rPr>
-          <w:rStyle w:val="hljs-comment"/>
-          <w:rFonts w:ascii="Segoe UI Emoji" w:eastAsiaTheme="majorEastAsia" w:hAnsi="Segoe UI Emoji" w:cs="Segoe UI Emoji"/>
-        </w:rPr>
-        <w:t>📈</w:t>
-      </w:r>
-      <w:r>
-        <w:rPr>
-          <w:rStyle w:val="hljs-comment"/>
-          <w:rFonts w:eastAsiaTheme="majorEastAsia"/>
-          <w:lang w:val="es-ES"/>
-        </w:rPr>
-        <w:t xml:space="preserve"> BI &amp; Marketing") en una sola línea siempre */</w:t>
-      </w:r>
-    </w:p>
-    <w:p>
-      <w:pPr>
-        <w:pStyle w:val="HTMLPreformatted"/>
-        <w:rPr>
-          <w:rStyle w:val="HTMLCode"/>
-          <w:rFonts w:eastAsiaTheme="majorEastAsia"/>
-          <w:lang w:val="es-ES"/>
-        </w:rPr>
-      </w:pPr>
-      <w:r>
-        <w:rPr>
-          <w:rStyle w:val="HTMLCode"/>
-          <w:rFonts w:eastAsiaTheme="majorEastAsia"/>
-          <w:lang w:val="es-ES"/>
-        </w:rPr>
-        <w:t>}</w:t>
-      </w:r>
-    </w:p>
-    <w:p>
-      <w:pPr>
-        <w:pStyle w:val="Heading3"/>
-      </w:pPr>
-      <w:r>
-        <w:rPr>
-          <w:rFonts w:ascii="Segoe UI Emoji" w:hAnsi="Segoe UI Emoji" w:cs="Segoe UI Emoji"/>
-        </w:rPr>
-        <w:lastRenderedPageBreak/>
-        <w:t>💡</w:t>
-      </w:r>
-      <w:r>
-        <w:t xml:space="preserve"> ¿Por qué funciona esto tan bien?</w:t>
-      </w:r>
-    </w:p>
-    <w:p>
-      <w:pPr>
-        <w:pStyle w:val="NormalWeb"/>
-        <w:numPr>
-          <w:ilvl w:val="0"/>
-          <w:numId w:val="24"/>
-        </w:numPr>
-        <w:rPr>
-          <w:lang w:val="es-ES"/>
-        </w:rPr>
-      </w:pPr>
-      <w:proofErr w:type="spellStart"/>
-      <w:r>
-        <w:rPr>
-          <w:rStyle w:val="HTMLCode"/>
-          <w:rFonts w:eastAsiaTheme="majorEastAsia"/>
-          <w:b/>
-          <w:bCs/>
-          <w:lang w:val="es-ES"/>
-        </w:rPr>
-        <w:t>flex-shrink</w:t>
-      </w:r>
-      <w:proofErr w:type="spellEnd"/>
-      <w:r>
-        <w:rPr>
-          <w:rStyle w:val="HTMLCode"/>
-          <w:rFonts w:eastAsiaTheme="majorEastAsia"/>
-          <w:b/>
-          <w:bCs/>
-          <w:lang w:val="es-ES"/>
-        </w:rPr>
-        <w:t xml:space="preserve">: </w:t>
-      </w:r>
-      <w:proofErr w:type="gramStart"/>
-      <w:r>
-        <w:rPr>
-          <w:rStyle w:val="HTMLCode"/>
-          <w:rFonts w:eastAsiaTheme="majorEastAsia"/>
-          <w:b/>
-          <w:bCs/>
-          <w:lang w:val="es-ES"/>
-        </w:rPr>
-        <w:t>0;</w:t>
-      </w:r>
-      <w:r>
-        <w:rPr>
-          <w:lang w:val="es-ES"/>
-        </w:rPr>
-        <w:t>:</w:t>
-      </w:r>
-      <w:proofErr w:type="gramEnd"/>
-      <w:r>
-        <w:rPr>
-          <w:lang w:val="es-ES"/>
-        </w:rPr>
-        <w:t xml:space="preserve"> Es el salvavidas. Le dice al navegador: </w:t>
-      </w:r>
-      <w:r>
-        <w:rPr>
-          <w:i/>
-          <w:iCs/>
-          <w:lang w:val="es-ES"/>
-        </w:rPr>
-        <w:t>"Respeta el tamaño original del botón, no me importa si la pantalla es de 300px de ancho"</w:t>
-      </w:r>
-      <w:r>
-        <w:rPr>
-          <w:lang w:val="es-ES"/>
-        </w:rPr>
-        <w:t>.</w:t>
-      </w:r>
-    </w:p>
-    <w:p>
-      <w:pPr>
-        <w:pStyle w:val="NormalWeb"/>
-        <w:numPr>
-          <w:ilvl w:val="0"/>
-          <w:numId w:val="24"/>
-        </w:numPr>
-        <w:rPr>
-          <w:lang w:val="es-ES"/>
-        </w:rPr>
-      </w:pPr>
-      <w:r>
-        <w:rPr>
-          <w:b/>
-          <w:bCs/>
-          <w:lang w:val="es-ES"/>
-        </w:rPr>
-        <w:t xml:space="preserve">Los </w:t>
-      </w:r>
-      <w:proofErr w:type="spellStart"/>
-      <w:r>
-        <w:rPr>
-          <w:b/>
-          <w:bCs/>
-          <w:lang w:val="es-ES"/>
-        </w:rPr>
-        <w:t>pseudo-</w:t>
-      </w:r>
-      <w:proofErr w:type="gramStart"/>
-      <w:r>
-        <w:rPr>
-          <w:b/>
-          <w:bCs/>
-          <w:lang w:val="es-ES"/>
-        </w:rPr>
-        <w:t>elementos</w:t>
-      </w:r>
-      <w:proofErr w:type="spellEnd"/>
-      <w:r>
-        <w:rPr>
-          <w:b/>
-          <w:bCs/>
-          <w:lang w:val="es-ES"/>
-        </w:rPr>
-        <w:t xml:space="preserve"> </w:t>
-      </w:r>
-      <w:r>
-        <w:rPr>
-          <w:rStyle w:val="HTMLCode"/>
-          <w:rFonts w:eastAsiaTheme="majorEastAsia"/>
-          <w:b/>
-          <w:bCs/>
-          <w:lang w:val="es-ES"/>
-        </w:rPr>
-        <w:t>::-</w:t>
-      </w:r>
-      <w:proofErr w:type="gramEnd"/>
-      <w:r>
-        <w:rPr>
-          <w:rStyle w:val="HTMLCode"/>
-          <w:rFonts w:eastAsiaTheme="majorEastAsia"/>
-          <w:b/>
-          <w:bCs/>
-          <w:lang w:val="es-ES"/>
-        </w:rPr>
-        <w:t>webkit-</w:t>
-      </w:r>
-      <w:proofErr w:type="spellStart"/>
-      <w:r>
-        <w:rPr>
-          <w:rStyle w:val="HTMLCode"/>
-          <w:rFonts w:eastAsiaTheme="majorEastAsia"/>
-          <w:b/>
-          <w:bCs/>
-          <w:lang w:val="es-ES"/>
-        </w:rPr>
-        <w:t>scrollbar</w:t>
-      </w:r>
-      <w:proofErr w:type="spellEnd"/>
-      <w:r>
-        <w:rPr>
-          <w:lang w:val="es-ES"/>
-        </w:rPr>
-        <w:t>: Son los responsables de que la interfaz se vea premium. Al ocultar la barra gris, el usuario intuitivamente sabrá que puede deslizar el dedo sobre los botones, igual que en Instagram o YouTube.</w:t>
-      </w:r>
+        <w:rPr>
+          <w:lang w:val="es-ES"/>
+        </w:rPr>
+      </w:pPr>
     </w:p>
     <w:p>
       <w:r>
         <w:pict w14:anchorId="567D1AE1">
-          <v:rect id="_x0000_i1031" style="width:0;height:1.5pt" o:hralign="center" o:hrstd="t" o:hr="t" fillcolor="#a0a0a0" stroked="f"/>
+          <v:rect id="_x0000_i1029" style="width:0;height:1.5pt" o:hralign="center" o:hrstd="t" o:hr="t" fillcolor="#a0a0a0" stroked="f"/>
         </w:pict>
       </w:r>
     </w:p>
@@ -6655,16 +6452,7 @@
           <w:sz w:val="52"/>
           <w:szCs w:val="52"/>
         </w:rPr>
-        <w:t>️ La Metodología Recomendada (3 Pilares)</w:t>
-      </w:r>
-      <w:r>
-        <w:rPr>
-          <w:b/>
-          <w:bCs/>
-          <w:sz w:val="52"/>
-          <w:szCs w:val="52"/>
-        </w:rPr>
-        <w:t xml:space="preserve"> – Comisiones y Premios</w:t>
+        <w:t>️ La Metodología Recomendada (3 Pilares) – Comisiones y Premios</w:t>
       </w:r>
     </w:p>
     <w:p>
@@ -7241,7 +7029,7 @@
     <w:p>
       <w:r>
         <w:pict w14:anchorId="0D0463E4">
-          <v:rect id="_x0000_i1057" style="width:0;height:1.5pt" o:hralign="center" o:hrstd="t" o:hr="t" fillcolor="#a0a0a0" stroked="f"/>
+          <v:rect id="_x0000_i1030" style="width:0;height:1.5pt" o:hralign="center" o:hrstd="t" o:hr="t" fillcolor="#a0a0a0" stroked="f"/>
         </w:pict>
       </w:r>
     </w:p>
@@ -9383,13 +9171,16 @@
     <w:p>
       <w:r>
         <w:pict w14:anchorId="7C78E842">
-          <v:rect id="_x0000_i1058" style="width:0;height:1.5pt" o:hralign="center" o:hrstd="t" o:hr="t" fillcolor="#a0a0a0" stroked="f"/>
+          <v:rect id="_x0000_i1031" style="width:0;height:1.5pt" o:hralign="center" o:hrstd="t" o:hr="t" fillcolor="#a0a0a0" stroked="f"/>
         </w:pict>
       </w:r>
     </w:p>
     <w:p>
       <w:pPr>
         <w:pStyle w:val="NormalWeb"/>
+        <w:rPr>
+          <w:lang w:val="es-ES"/>
+        </w:rPr>
       </w:pPr>
       <w:r>
         <w:rPr>
@@ -9397,29 +9188,11 @@
         </w:rPr>
         <w:t xml:space="preserve">¡Todo estructurado, actualizado y listo para la acción! Espero que tengas un excelente descanso y que la jornada de mañana sea súper productiva. </w:t>
       </w:r>
-      <w:proofErr w:type="spellStart"/>
-      <w:r>
-        <w:t>Quedo</w:t>
-      </w:r>
-      <w:proofErr w:type="spellEnd"/>
-      <w:r>
-        <w:t xml:space="preserve"> por </w:t>
-      </w:r>
-      <w:proofErr w:type="spellStart"/>
-      <w:r>
-        <w:t>aquí</w:t>
-      </w:r>
-      <w:proofErr w:type="spellEnd"/>
-      <w:r>
-        <w:t xml:space="preserve"> para lo que </w:t>
-      </w:r>
-      <w:proofErr w:type="spellStart"/>
-      <w:r>
-        <w:t>necesites</w:t>
-      </w:r>
-      <w:proofErr w:type="spellEnd"/>
-      <w:r>
-        <w:t>.</w:t>
+      <w:r>
+        <w:rPr>
+          <w:lang w:val="es-ES"/>
+        </w:rPr>
+        <w:t>Quedo por aquí para lo que necesites.</w:t>
       </w:r>
     </w:p>
     <w:p>
@@ -11696,7 +11469,7 @@
     <w:p>
       <w:r>
         <w:pict w14:anchorId="04604859">
-          <v:rect id="_x0000_i1047" style="width:0;height:1.5pt" o:hralign="center" o:hrstd="t" o:hr="t" fillcolor="#a0a0a0" stroked="f"/>
+          <v:rect id="_x0000_i1032" style="width:0;height:1.5pt" o:hralign="center" o:hrstd="t" o:hr="t" fillcolor="#a0a0a0" stroked="f"/>
         </w:pict>
       </w:r>
     </w:p>
@@ -17710,7 +17483,6 @@
     <w:next w:val="Normal"/>
     <w:link w:val="Heading3Char"/>
     <w:uiPriority w:val="9"/>
-    <w:semiHidden/>
     <w:unhideWhenUsed/>
     <w:qFormat/>
     <w:rsid w:val="00263EA2"/>
@@ -17918,7 +17690,6 @@
     <w:basedOn w:val="DefaultParagraphFont"/>
     <w:link w:val="Heading3"/>
     <w:uiPriority w:val="9"/>
-    <w:semiHidden/>
     <w:rsid w:val="00263EA2"/>
     <w:rPr>
       <w:rFonts w:eastAsiaTheme="majorEastAsia" w:cstheme="majorBidi"/>

</xml_diff>